<commit_message>
Fix contract border lines and budget wording
</commit_message>
<xml_diff>
--- a/contract-pdf-work/templates/Umowa_Zamowienia_Pojazdu_AG_template.docx
+++ b/contract-pdf-work/templates/Umowa_Zamowienia_Pojazdu_AG_template.docx
@@ -1,8 +1,8 @@
 
 <file path=word/document.xml><?xml version="1.0" encoding="utf-8"?>
-<w:document xmlns:wpc="http://schemas.microsoft.com/office/word/2010/wordprocessingCanvas" xmlns:cx="http://schemas.microsoft.com/office/drawing/2014/chartex" xmlns:cx1="http://schemas.microsoft.com/office/drawing/2015/9/8/chartex" xmlns:cx2="http://schemas.microsoft.com/office/drawing/2015/10/21/chartex" xmlns:cx3="http://schemas.microsoft.com/office/drawing/2016/5/9/chartex" xmlns:cx4="http://schemas.microsoft.com/office/drawing/2016/5/10/chartex" xmlns:cx5="http://schemas.microsoft.com/office/drawing/2016/5/11/chartex" xmlns:cx6="http://schemas.microsoft.com/office/drawing/2016/5/12/chartex" xmlns:cx7="http://schemas.microsoft.com/office/drawing/2016/5/13/chartex" xmlns:cx8="http://schemas.microsoft.com/office/drawing/2016/5/14/chartex" xmlns:mc="http://schemas.openxmlformats.org/markup-compatibility/2006" xmlns:aink="http://schemas.microsoft.com/office/drawing/2016/ink" xmlns:am3d="http://schemas.microsoft.com/office/drawing/2017/model3d" xmlns:o="urn:schemas-microsoft-com:office:office" xmlns:oel="http://schemas.microsoft.com/office/2019/extlst" xmlns:r="http://schemas.openxmlformats.org/officeDocument/2006/relationships" xmlns:m="http://schemas.openxmlformats.org/officeDocument/2006/math" xmlns:v="urn:schemas-microsoft-com:vml" xmlns:wp14="http://schemas.microsoft.com/office/word/2010/wordprocessingDrawing" xmlns:wp="http://schemas.openxmlformats.org/drawingml/2006/wordprocessingDrawing" xmlns:w10="urn:schemas-microsoft-com:office:word" xmlns:w="http://schemas.openxmlformats.org/wordprocessingml/2006/main" xmlns:w14="http://schemas.microsoft.com/office/word/2010/wordml" xmlns:w15="http://schemas.microsoft.com/office/word/2012/wordml" xmlns:w16cex="http://schemas.microsoft.com/office/word/2018/wordml/cex" xmlns:w16cid="http://schemas.microsoft.com/office/word/2016/wordml/cid" xmlns:w16="http://schemas.microsoft.com/office/word/2018/wordml" xmlns:w16sdtdh="http://schemas.microsoft.com/office/word/2020/wordml/sdtdatahash" xmlns:w16se="http://schemas.microsoft.com/office/word/2015/wordml/symex" xmlns:wpg="http://schemas.microsoft.com/office/word/2010/wordprocessingGroup" xmlns:wpi="http://schemas.microsoft.com/office/word/2010/wordprocessingInk" xmlns:wne="http://schemas.microsoft.com/office/word/2006/wordml" xmlns:wps="http://schemas.microsoft.com/office/word/2010/wordprocessingShape" mc:Ignorable="w14 w15 w16se w16cid w16 w16cex w16sdtdh wp14">
+<w:document xmlns:ns1="http://schemas.openxmlformats.org/markup-compatibility/2006" xmlns:ns2="http://schemas.microsoft.com/office/word/2010/wordml" xmlns:ns3="http://schemas.openxmlformats.org/drawingml/2006/wordprocessingDrawing" xmlns:ns4="http://schemas.microsoft.com/office/word/2010/wordprocessingDrawing" xmlns:ns5="http://schemas.openxmlformats.org/drawingml/2006/main" xmlns:ns6="http://schemas.openxmlformats.org/drawingml/2006/picture" xmlns:ns7="http://schemas.openxmlformats.org/officeDocument/2006/relationships" xmlns:ns8="http://schemas.microsoft.com/office/drawing/2010/main" xmlns:w="http://schemas.openxmlformats.org/wordprocessingml/2006/main" ns1:Ignorable="w14 w15 w16se w16cid w16 w16cex w16sdtdh wp14">
   <w:body>
-    <w:p>
+    <w:p ns2:paraId="6E29C556" ns2:textId="3077B87D">
       <w:pPr>
         <w:jc w:val="right"/>
         <w:rPr>
@@ -61,7 +61,7 @@
         <w:t xml:space="preserve"> roku</w:t>
       </w:r>
     </w:p>
-    <w:p>
+    <w:p ns2:paraId="05E0C0FE" ns2:textId="008A4217">
       <w:pPr>
         <w:spacing w:line="276" w:lineRule="auto"/>
         <w:jc w:val="both"/>
@@ -106,7 +106,7 @@
         <w:gridCol w:w="2895"/>
         <w:gridCol w:w="10"/>
       </w:tblGrid>
-      <w:tr>
+      <w:tr ns2:paraId="41153943" ns2:textId="77777777">
         <w:trPr>
           <w:cnfStyle w:val="100000000000" w:firstRow="1" w:lastRow="0" w:firstColumn="0" w:lastColumn="0" w:oddVBand="0" w:evenVBand="0" w:oddHBand="0" w:evenHBand="0" w:firstRowFirstColumn="0" w:firstRowLastColumn="0" w:lastRowFirstColumn="0" w:lastRowLastColumn="0"/>
           <w:trHeight w:val="81"/>
@@ -119,7 +119,7 @@
               <w:bottom w:val="nil"/>
             </w:tcBorders>
           </w:tcPr>
-          <w:p>
+          <w:p ns2:paraId="1A587BF6" ns2:textId="77777777">
             <w:pPr>
               <w:rPr>
                 <w:sz w:val="10"/>
@@ -136,7 +136,7 @@
               <w:bottom w:val="nil"/>
             </w:tcBorders>
           </w:tcPr>
-          <w:p>
+          <w:p ns2:paraId="4F983BDF" ns2:textId="77777777">
             <w:pPr>
               <w:cnfStyle w:val="100000000000" w:firstRow="1" w:lastRow="0" w:firstColumn="0" w:lastColumn="0" w:oddVBand="0" w:evenVBand="0" w:oddHBand="0" w:evenHBand="0" w:firstRowFirstColumn="0" w:firstRowLastColumn="0" w:lastRowFirstColumn="0" w:lastRowLastColumn="0"/>
               <w:rPr>
@@ -154,7 +154,7 @@
               <w:bottom w:val="nil"/>
             </w:tcBorders>
           </w:tcPr>
-          <w:p>
+          <w:p ns2:paraId="1E3DB9FF" ns2:textId="77777777">
             <w:pPr>
               <w:jc w:val="center"/>
               <w:cnfStyle w:val="100000000000" w:firstRow="1" w:lastRow="0" w:firstColumn="0" w:lastColumn="0" w:oddVBand="0" w:evenVBand="0" w:oddHBand="0" w:evenHBand="0" w:firstRowFirstColumn="0" w:firstRowLastColumn="0" w:lastRowFirstColumn="0" w:lastRowLastColumn="0"/>
@@ -166,7 +166,7 @@
           </w:p>
         </w:tc>
       </w:tr>
-      <w:tr>
+      <w:tr ns2:paraId="757CFC26" ns2:textId="77777777">
         <w:tc>
           <w:tcPr>
             <w:cnfStyle w:val="001000000000" w:firstRow="0" w:lastRow="0" w:firstColumn="1" w:lastColumn="0" w:oddVBand="0" w:evenVBand="0" w:oddHBand="0" w:evenHBand="0" w:firstRowFirstColumn="0" w:firstRowLastColumn="0" w:lastRowFirstColumn="0" w:lastRowLastColumn="0"/>
@@ -174,10 +174,11 @@
             <w:gridSpan w:val="2"/>
             <w:tcBorders>
               <w:bottom w:val="single" w:sz="2" w:space="0" w:color="9CC2E5" w:themeColor="accent5" w:themeTint="99"/>
+              <w:right w:val="single" w:sz="2" w:space="0" w:color="9CC2E5" w:themeColor="accent5" w:themeTint="99"/>
             </w:tcBorders>
             <w:shd w:val="clear" w:color="auto" w:fill="0070C0"/>
           </w:tcPr>
-          <w:p>
+          <w:p ns2:paraId="6642A012" ns2:textId="77777777">
             <w:pPr>
               <w:jc w:val="center"/>
               <w:rPr>
@@ -212,7 +213,7 @@
               <w:bottom w:val="nil"/>
             </w:tcBorders>
           </w:tcPr>
-          <w:p>
+          <w:p ns2:paraId="2503BF7D" ns2:textId="77777777">
             <w:pPr>
               <w:cnfStyle w:val="000000000000" w:firstRow="0" w:lastRow="0" w:firstColumn="0" w:lastColumn="0" w:oddVBand="0" w:evenVBand="0" w:oddHBand="0" w:evenHBand="0" w:firstRowFirstColumn="0" w:firstRowLastColumn="0" w:lastRowFirstColumn="0" w:lastRowLastColumn="0"/>
               <w:rPr>
@@ -227,8 +228,11 @@
             <w:tcW w:w="4819" w:type="dxa"/>
             <w:gridSpan w:val="3"/>
             <w:shd w:val="clear" w:color="auto" w:fill="0070C0"/>
+            <w:tcBorders>
+              <w:left w:val="single" w:sz="2" w:space="0" w:color="9CC2E5" w:themeColor="accent5" w:themeTint="99"/>
+            </w:tcBorders>
           </w:tcPr>
-          <w:p>
+          <w:p ns2:paraId="1BD5D5EF" ns2:textId="77777777">
             <w:pPr>
               <w:ind w:left="-111" w:firstLine="111"/>
               <w:jc w:val="center"/>
@@ -261,7 +265,7 @@
           </w:p>
         </w:tc>
       </w:tr>
-      <w:tr>
+      <w:tr ns2:paraId="46AEC33E" ns2:textId="77777777">
         <w:tc>
           <w:tcPr>
             <w:cnfStyle w:val="001000000000" w:firstRow="0" w:lastRow="0" w:firstColumn="1" w:lastColumn="0" w:oddVBand="0" w:evenVBand="0" w:oddHBand="0" w:evenHBand="0" w:firstRowFirstColumn="0" w:firstRowLastColumn="0" w:lastRowFirstColumn="0" w:lastRowLastColumn="0"/>
@@ -269,11 +273,11 @@
             <w:gridSpan w:val="2"/>
             <w:tcBorders>
               <w:left w:val="single" w:sz="2" w:space="0" w:color="9CC2E5" w:themeColor="accent5" w:themeTint="99"/>
-              <w:right w:val="nil"/>
+              <w:right w:val="single" w:sz="2" w:space="0" w:color="9CC2E5" w:themeColor="accent5" w:themeTint="99"/>
             </w:tcBorders>
             <w:shd w:val="clear" w:color="auto" w:fill="auto"/>
           </w:tcPr>
-          <w:p>
+          <w:p ns2:paraId="2D431ACC" ns2:textId="77777777">
             <w:pPr>
               <w:spacing w:line="360" w:lineRule="auto"/>
               <w:rPr>
@@ -286,7 +290,7 @@
               </w:rPr>
             </w:pPr>
           </w:p>
-          <w:p>
+          <w:p ns2:paraId="5971DC15" ns2:textId="65D41C18">
             <w:pPr>
               <w:spacing w:line="360" w:lineRule="auto"/>
               <w:rPr>
@@ -358,7 +362,7 @@
               <w:br/>
             </w:r>
           </w:p>
-          <w:p>
+          <w:p ns2:paraId="3D274BD2" ns2:textId="53AF966E">
             <w:pPr>
               <w:rPr>
                 <w:rFonts w:ascii="Calibri" w:hAnsi="Calibri"/>
@@ -375,11 +379,11 @@
                   <w:szCs w:val="28"/>
                 </w:rPr>
                 <w:id w:val="-1025166611"/>
-                <w14:checkbox>
-                  <w14:checked w14:val="0"/>
-                  <w14:checkedState w14:val="00FE" w14:font="Wingdings"/>
-                  <w14:uncheckedState w14:val="00A8" w14:font="Wingdings"/>
-                </w14:checkbox>
+                <ns2:checkbox>
+                  <ns2:checked ns2:val="0"/>
+                  <ns2:checkedState ns2:val="00FE" ns2:font="Wingdings"/>
+                  <ns2:uncheckedState ns2:val="00A8" ns2:font="Wingdings"/>
+                </ns2:checkbox>
               </w:sdtPr>
               <w:sdtContent>
                 <w:r>
@@ -445,7 +449,7 @@
             </w:tcBorders>
             <w:shd w:val="clear" w:color="auto" w:fill="auto"/>
           </w:tcPr>
-          <w:p>
+          <w:p ns2:paraId="27947EFF" ns2:textId="77777777">
             <w:pPr>
               <w:cnfStyle w:val="000000000000" w:firstRow="0" w:lastRow="0" w:firstColumn="0" w:lastColumn="0" w:oddVBand="0" w:evenVBand="0" w:oddHBand="0" w:evenHBand="0" w:firstRowFirstColumn="0" w:firstRowLastColumn="0" w:lastRowFirstColumn="0" w:lastRowLastColumn="0"/>
               <w:rPr>
@@ -459,8 +463,11 @@
             <w:tcW w:w="4819" w:type="dxa"/>
             <w:gridSpan w:val="3"/>
             <w:shd w:val="clear" w:color="auto" w:fill="auto"/>
+            <w:tcBorders>
+              <w:left w:val="single" w:sz="2" w:space="0" w:color="9CC2E5" w:themeColor="accent5" w:themeTint="99"/>
+            </w:tcBorders>
           </w:tcPr>
-          <w:p>
+          <w:p ns2:paraId="06D8CFF6" ns2:textId="77777777">
             <w:pPr>
               <w:jc w:val="center"/>
               <w:cnfStyle w:val="000000000000" w:firstRow="0" w:lastRow="0" w:firstColumn="0" w:lastColumn="0" w:oddVBand="0" w:evenVBand="0" w:oddHBand="0" w:evenHBand="0" w:firstRowFirstColumn="0" w:firstRowLastColumn="0" w:lastRowFirstColumn="0" w:lastRowLastColumn="0"/>
@@ -475,57 +482,57 @@
                 <w:noProof/>
               </w:rPr>
               <w:drawing>
-                <wp:inline distT="0" distB="0" distL="0" distR="0" wp14:anchorId="5249618D" wp14:editId="00BD10DA">
-                  <wp:extent cx="2853248" cy="687091"/>
-                  <wp:effectExtent l="0" t="0" r="4445" b="0"/>
-                  <wp:docPr id="1549759868" name="Obraz 1"/>
-                  <wp:cNvGraphicFramePr>
-                    <a:graphicFrameLocks xmlns:a="http://schemas.openxmlformats.org/drawingml/2006/main" noChangeAspect="1"/>
-                  </wp:cNvGraphicFramePr>
-                  <a:graphic xmlns:a="http://schemas.openxmlformats.org/drawingml/2006/main">
-                    <a:graphicData uri="http://schemas.openxmlformats.org/drawingml/2006/picture">
-                      <pic:pic xmlns:pic="http://schemas.openxmlformats.org/drawingml/2006/picture">
-                        <pic:nvPicPr>
-                          <pic:cNvPr id="1549759868" name="Picture 1"/>
-                          <pic:cNvPicPr>
-                            <a:picLocks noChangeAspect="1" noChangeArrowheads="1"/>
-                          </pic:cNvPicPr>
-                        </pic:nvPicPr>
-                        <pic:blipFill>
-                          <a:blip r:embed="rId8" r:link="rId9">
-                            <a:extLst>
-                              <a:ext uri="{28A0092B-C50C-407E-A947-70E740481C1C}">
-                                <a14:useLocalDpi xmlns:a14="http://schemas.microsoft.com/office/drawing/2010/main" val="0"/>
-                              </a:ext>
-                            </a:extLst>
-                          </a:blip>
-                          <a:stretch>
-                            <a:fillRect/>
-                          </a:stretch>
-                        </pic:blipFill>
-                        <pic:spPr bwMode="auto">
-                          <a:xfrm>
-                            <a:off x="0" y="0"/>
-                            <a:ext cx="2914215" cy="701773"/>
-                          </a:xfrm>
-                          <a:prstGeom prst="rect">
-                            <a:avLst/>
-                          </a:prstGeom>
-                          <a:noFill/>
-                          <a:ln>
-                            <a:noFill/>
-                          </a:ln>
-                        </pic:spPr>
-                      </pic:pic>
-                    </a:graphicData>
-                  </a:graphic>
-                </wp:inline>
+                <ns3:inline distT="0" distB="0" distL="0" distR="0" ns4:anchorId="5249618D" ns4:editId="00BD10DA">
+                  <ns3:extent cx="2853248" cy="687091"/>
+                  <ns3:effectExtent l="0" t="0" r="4445" b="0"/>
+                  <ns3:docPr id="1549759868" name="Obraz 1"/>
+                  <ns3:cNvGraphicFramePr>
+                    <ns5:graphicFrameLocks noChangeAspect="1"/>
+                  </ns3:cNvGraphicFramePr>
+                  <ns5:graphic>
+                    <ns5:graphicData uri="http://schemas.openxmlformats.org/drawingml/2006/picture">
+                      <ns6:pic>
+                        <ns6:nvPicPr>
+                          <ns6:cNvPr id="1549759868" name="Picture 1"/>
+                          <ns6:cNvPicPr>
+                            <ns5:picLocks noChangeAspect="1" noChangeArrowheads="1"/>
+                          </ns6:cNvPicPr>
+                        </ns6:nvPicPr>
+                        <ns6:blipFill>
+                          <ns5:blip ns7:embed="rId8" ns7:link="rId9">
+                            <ns5:extLst>
+                              <ns5:ext uri="{28A0092B-C50C-407E-A947-70E740481C1C}">
+                                <ns8:useLocalDpi val="0"/>
+                              </ns5:ext>
+                            </ns5:extLst>
+                          </ns5:blip>
+                          <ns5:stretch>
+                            <ns5:fillRect/>
+                          </ns5:stretch>
+                        </ns6:blipFill>
+                        <ns6:spPr bwMode="auto">
+                          <ns5:xfrm>
+                            <ns5:off x="0" y="0"/>
+                            <ns5:ext cx="2914215" cy="701773"/>
+                          </ns5:xfrm>
+                          <ns5:prstGeom prst="rect">
+                            <ns5:avLst/>
+                          </ns5:prstGeom>
+                          <ns5:noFill/>
+                          <ns5:ln>
+                            <ns5:noFill/>
+                          </ns5:ln>
+                        </ns6:spPr>
+                      </ns6:pic>
+                    </ns5:graphicData>
+                  </ns5:graphic>
+                </ns3:inline>
               </w:drawing>
             </w:r>
           </w:p>
         </w:tc>
       </w:tr>
-      <w:tr>
+      <w:tr ns2:paraId="40387EBD" ns2:textId="77777777">
         <w:tc>
           <w:tcPr>
             <w:cnfStyle w:val="001000000000" w:firstRow="0" w:lastRow="0" w:firstColumn="1" w:lastColumn="0" w:oddVBand="0" w:evenVBand="0" w:oddHBand="0" w:evenHBand="0" w:firstRowFirstColumn="0" w:firstRowLastColumn="0" w:lastRowFirstColumn="0" w:lastRowLastColumn="0"/>
@@ -534,11 +541,11 @@
             <w:tcBorders>
               <w:left w:val="single" w:sz="2" w:space="0" w:color="9CC2E5" w:themeColor="accent5" w:themeTint="99"/>
               <w:bottom w:val="single" w:sz="2" w:space="0" w:color="9CC2E5" w:themeColor="accent5" w:themeTint="99"/>
-              <w:right w:val="nil"/>
+              <w:right w:val="single" w:sz="2" w:space="0" w:color="9CC2E5" w:themeColor="accent5" w:themeTint="99"/>
             </w:tcBorders>
             <w:shd w:val="clear" w:color="auto" w:fill="auto"/>
           </w:tcPr>
-          <w:p>
+          <w:p ns2:paraId="1CC5080B" ns2:textId="77777777">
             <w:pPr>
               <w:spacing w:line="276" w:lineRule="auto"/>
               <w:rPr>
@@ -551,7 +558,7 @@
               </w:rPr>
             </w:pPr>
           </w:p>
-          <w:p>
+          <w:p ns2:paraId="5282F547" ns2:textId="77777777">
             <w:pPr>
               <w:spacing w:line="276" w:lineRule="auto"/>
               <w:rPr>
@@ -598,7 +605,7 @@
               <w:t xml:space="preserve"> </w:t>
             </w:r>
           </w:p>
-          <w:p>
+          <w:p ns2:paraId="3F977A58" ns2:textId="76C33E6D">
             <w:pPr>
               <w:spacing w:line="276" w:lineRule="auto"/>
               <w:rPr>
@@ -622,7 +629,7 @@
             </w:tcBorders>
             <w:shd w:val="clear" w:color="auto" w:fill="auto"/>
           </w:tcPr>
-          <w:p>
+          <w:p ns2:paraId="313D4D33" ns2:textId="77777777">
             <w:pPr>
               <w:cnfStyle w:val="000000000000" w:firstRow="0" w:lastRow="0" w:firstColumn="0" w:lastColumn="0" w:oddVBand="0" w:evenVBand="0" w:oddHBand="0" w:evenHBand="0" w:firstRowFirstColumn="0" w:firstRowLastColumn="0" w:lastRowFirstColumn="0" w:lastRowLastColumn="0"/>
               <w:rPr>
@@ -637,8 +644,11 @@
             <w:tcW w:w="4819" w:type="dxa"/>
             <w:gridSpan w:val="3"/>
             <w:shd w:val="clear" w:color="auto" w:fill="auto"/>
+            <w:tcBorders>
+              <w:left w:val="single" w:sz="2" w:space="0" w:color="9CC2E5" w:themeColor="accent5" w:themeTint="99"/>
+            </w:tcBorders>
           </w:tcPr>
-          <w:p>
+          <w:p ns2:paraId="73A2413A" ns2:textId="77777777">
             <w:pPr>
               <w:cnfStyle w:val="000000000000" w:firstRow="0" w:lastRow="0" w:firstColumn="0" w:lastColumn="0" w:oddVBand="0" w:evenVBand="0" w:oddHBand="0" w:evenHBand="0" w:firstRowFirstColumn="0" w:firstRowLastColumn="0" w:lastRowFirstColumn="0" w:lastRowLastColumn="0"/>
               <w:rPr>
@@ -654,7 +664,7 @@
             <w:bookmarkStart w:id="1" w:name="OLE_LINK8"/>
             <w:bookmarkStart w:id="2" w:name="OLE_LINK9"/>
           </w:p>
-          <w:p>
+          <w:p ns2:paraId="17C75F18" ns2:textId="32C425A2">
             <w:pPr>
               <w:cnfStyle w:val="000000000000" w:firstRow="0" w:lastRow="0" w:firstColumn="0" w:lastColumn="0" w:oddVBand="0" w:evenVBand="0" w:oddHBand="0" w:evenHBand="0" w:firstRowFirstColumn="0" w:firstRowLastColumn="0" w:lastRowFirstColumn="0" w:lastRowLastColumn="0"/>
               <w:rPr>
@@ -686,7 +696,7 @@
               <w:t xml:space="preserve"> Sp. z o.o.</w:t>
             </w:r>
           </w:p>
-          <w:p>
+          <w:p ns2:paraId="5697CCB9" ns2:textId="77777777">
             <w:pPr>
               <w:jc w:val="both"/>
               <w:cnfStyle w:val="000000000000" w:firstRow="0" w:lastRow="0" w:firstColumn="0" w:lastColumn="0" w:oddVBand="0" w:evenVBand="0" w:oddHBand="0" w:evenHBand="0" w:firstRowFirstColumn="0" w:firstRowLastColumn="0" w:lastRowFirstColumn="0" w:lastRowLastColumn="0"/>
@@ -737,7 +747,7 @@
             <w:bookmarkEnd w:id="1"/>
             <w:bookmarkEnd w:id="2"/>
           </w:p>
-          <w:p>
+          <w:p ns2:paraId="1895A71B" ns2:textId="1E8894B0">
             <w:pPr>
               <w:jc w:val="both"/>
               <w:cnfStyle w:val="000000000000" w:firstRow="0" w:lastRow="0" w:firstColumn="0" w:lastColumn="0" w:oddVBand="0" w:evenVBand="0" w:oddHBand="0" w:evenHBand="0" w:firstRowFirstColumn="0" w:firstRowLastColumn="0" w:lastRowFirstColumn="0" w:lastRowLastColumn="0"/>
@@ -817,7 +827,7 @@
           </w:p>
         </w:tc>
       </w:tr>
-      <w:tr>
+      <w:tr ns2:paraId="30A54338" ns2:textId="77777777">
         <w:trPr>
           <w:trHeight w:val="635"/>
         </w:trPr>
@@ -828,11 +838,11 @@
             <w:gridSpan w:val="2"/>
             <w:tcBorders>
               <w:left w:val="single" w:sz="2" w:space="0" w:color="9CC2E5" w:themeColor="accent5" w:themeTint="99"/>
-              <w:right w:val="nil"/>
+              <w:right w:val="single" w:sz="2" w:space="0" w:color="9CC2E5" w:themeColor="accent5" w:themeTint="99"/>
             </w:tcBorders>
             <w:shd w:val="clear" w:color="auto" w:fill="auto"/>
           </w:tcPr>
-          <w:p>
+          <w:p ns2:paraId="3C2B390E" ns2:textId="77777777">
             <w:pPr>
               <w:spacing w:line="276" w:lineRule="auto"/>
               <w:rPr>
@@ -843,7 +853,7 @@
               </w:rPr>
             </w:pPr>
           </w:p>
-          <w:p>
+          <w:p ns2:paraId="5AAA52FD" ns2:textId="77777777">
             <w:pPr>
               <w:spacing w:line="276" w:lineRule="auto"/>
               <w:rPr>
@@ -899,7 +909,7 @@
               <w:t xml:space="preserve"> </w:t>
             </w:r>
           </w:p>
-          <w:p>
+          <w:p ns2:paraId="584CC243" ns2:textId="77777777">
             <w:pPr>
               <w:spacing w:line="276" w:lineRule="auto"/>
               <w:rPr>
@@ -910,7 +920,7 @@
               </w:rPr>
             </w:pPr>
           </w:p>
-          <w:p>
+          <w:p ns2:paraId="3B25D158" ns2:textId="792498F3">
             <w:pPr>
               <w:spacing w:line="276" w:lineRule="auto"/>
               <w:rPr>
@@ -934,7 +944,7 @@
             </w:tcBorders>
             <w:shd w:val="clear" w:color="auto" w:fill="auto"/>
           </w:tcPr>
-          <w:p>
+          <w:p ns2:paraId="34DCDE62" ns2:textId="77777777">
             <w:pPr>
               <w:cnfStyle w:val="000000000000" w:firstRow="0" w:lastRow="0" w:firstColumn="0" w:lastColumn="0" w:oddVBand="0" w:evenVBand="0" w:oddHBand="0" w:evenHBand="0" w:firstRowFirstColumn="0" w:firstRowLastColumn="0" w:lastRowFirstColumn="0" w:lastRowLastColumn="0"/>
               <w:rPr>
@@ -948,8 +958,11 @@
             <w:tcW w:w="4819" w:type="dxa"/>
             <w:gridSpan w:val="3"/>
             <w:shd w:val="clear" w:color="auto" w:fill="auto"/>
+            <w:tcBorders>
+              <w:left w:val="single" w:sz="2" w:space="0" w:color="9CC2E5" w:themeColor="accent5" w:themeTint="99"/>
+            </w:tcBorders>
           </w:tcPr>
-          <w:p>
+          <w:p ns2:paraId="184C1F09" ns2:textId="77777777">
             <w:pPr>
               <w:spacing w:before="120"/>
               <w:jc w:val="both"/>
@@ -993,7 +1006,7 @@
               <w:t>:</w:t>
             </w:r>
           </w:p>
-          <w:p>
+          <w:p ns2:paraId="3B4F500C" ns2:textId="77777777">
             <w:pPr>
               <w:ind w:left="-111" w:firstLine="111"/>
               <w:cnfStyle w:val="000000000000" w:firstRow="0" w:lastRow="0" w:firstColumn="0" w:lastColumn="0" w:oddVBand="0" w:evenVBand="0" w:oddHBand="0" w:evenHBand="0" w:firstRowFirstColumn="0" w:firstRowLastColumn="0" w:lastRowFirstColumn="0" w:lastRowLastColumn="0"/>
@@ -1016,7 +1029,7 @@
               <w:t>97 1020 1026 0000 1102 0573 8432</w:t>
             </w:r>
           </w:p>
-          <w:p>
+          <w:p ns2:paraId="6CBEA38A" ns2:textId="77777777">
             <w:pPr>
               <w:ind w:left="-111" w:firstLine="111"/>
               <w:cnfStyle w:val="000000000000" w:firstRow="0" w:lastRow="0" w:firstColumn="0" w:lastColumn="0" w:oddVBand="0" w:evenVBand="0" w:oddHBand="0" w:evenHBand="0" w:firstRowFirstColumn="0" w:firstRowLastColumn="0" w:lastRowFirstColumn="0" w:lastRowLastColumn="0"/>
@@ -1036,7 +1049,7 @@
               <w:t>Rachunek bankowy do wpłat w EUR:</w:t>
             </w:r>
           </w:p>
-          <w:p>
+          <w:p ns2:paraId="6894D466" ns2:textId="2B9636C6">
             <w:pPr>
               <w:cnfStyle w:val="000000000000" w:firstRow="0" w:lastRow="0" w:firstColumn="0" w:lastColumn="0" w:oddVBand="0" w:evenVBand="0" w:oddHBand="0" w:evenHBand="0" w:firstRowFirstColumn="0" w:firstRowLastColumn="0" w:lastRowFirstColumn="0" w:lastRowLastColumn="0"/>
               <w:rPr>
@@ -1070,7 +1083,7 @@
           </w:p>
         </w:tc>
       </w:tr>
-      <w:tr>
+      <w:tr ns2:paraId="092D7EDE" ns2:textId="77777777">
         <w:tc>
           <w:tcPr>
             <w:cnfStyle w:val="001000000000" w:firstRow="0" w:lastRow="0" w:firstColumn="1" w:lastColumn="0" w:oddVBand="0" w:evenVBand="0" w:oddHBand="0" w:evenHBand="0" w:firstRowFirstColumn="0" w:firstRowLastColumn="0" w:lastRowFirstColumn="0" w:lastRowLastColumn="0"/>
@@ -1079,11 +1092,11 @@
             <w:tcBorders>
               <w:left w:val="single" w:sz="2" w:space="0" w:color="9CC2E5" w:themeColor="accent5" w:themeTint="99"/>
               <w:bottom w:val="single" w:sz="2" w:space="0" w:color="9CC2E5" w:themeColor="accent5" w:themeTint="99"/>
-              <w:right w:val="nil"/>
+              <w:right w:val="single" w:sz="2" w:space="0" w:color="9CC2E5" w:themeColor="accent5" w:themeTint="99"/>
             </w:tcBorders>
             <w:shd w:val="clear" w:color="auto" w:fill="auto"/>
           </w:tcPr>
-          <w:p>
+          <w:p ns2:paraId="15356769" ns2:textId="77777777">
             <w:pPr>
               <w:rPr>
                 <w:rFonts w:ascii="Calibri" w:hAnsi="Calibri"/>
@@ -1095,7 +1108,7 @@
               </w:rPr>
             </w:pPr>
           </w:p>
-          <w:p>
+          <w:p ns2:paraId="37FB1802" ns2:textId="0FDEB70B">
             <w:pPr>
               <w:spacing w:line="276" w:lineRule="auto"/>
               <w:rPr>
@@ -1160,7 +1173,7 @@
               <w:t xml:space="preserve"> </w:t>
             </w:r>
           </w:p>
-          <w:p>
+          <w:p ns2:paraId="470A8258" ns2:textId="23295A56">
             <w:pPr>
               <w:spacing w:line="276" w:lineRule="auto"/>
               <w:rPr>
@@ -1184,7 +1197,7 @@
             </w:tcBorders>
             <w:shd w:val="clear" w:color="auto" w:fill="auto"/>
           </w:tcPr>
-          <w:p>
+          <w:p ns2:paraId="793752B7" ns2:textId="77777777">
             <w:pPr>
               <w:cnfStyle w:val="000000000000" w:firstRow="0" w:lastRow="0" w:firstColumn="0" w:lastColumn="0" w:oddVBand="0" w:evenVBand="0" w:oddHBand="0" w:evenHBand="0" w:firstRowFirstColumn="0" w:firstRowLastColumn="0" w:lastRowFirstColumn="0" w:lastRowLastColumn="0"/>
               <w:rPr>
@@ -1198,8 +1211,11 @@
             <w:tcW w:w="4819" w:type="dxa"/>
             <w:gridSpan w:val="3"/>
             <w:shd w:val="clear" w:color="auto" w:fill="auto"/>
+            <w:tcBorders>
+              <w:left w:val="single" w:sz="2" w:space="0" w:color="9CC2E5" w:themeColor="accent5" w:themeTint="99"/>
+            </w:tcBorders>
           </w:tcPr>
-          <w:p>
+          <w:p ns2:paraId="7521B97F" ns2:textId="77777777">
             <w:pPr>
               <w:cnfStyle w:val="000000000000" w:firstRow="0" w:lastRow="0" w:firstColumn="0" w:lastColumn="0" w:oddVBand="0" w:evenVBand="0" w:oddHBand="0" w:evenHBand="0" w:firstRowFirstColumn="0" w:firstRowLastColumn="0" w:lastRowFirstColumn="0" w:lastRowLastColumn="0"/>
               <w:rPr>
@@ -1213,7 +1229,7 @@
               </w:rPr>
             </w:pPr>
           </w:p>
-          <w:p>
+          <w:p ns2:paraId="5A6D3422" ns2:textId="790CA4F8">
             <w:pPr>
               <w:spacing w:line="276" w:lineRule="auto"/>
               <w:cnfStyle w:val="000000000000" w:firstRow="0" w:lastRow="0" w:firstColumn="0" w:lastColumn="0" w:oddVBand="0" w:evenVBand="0" w:oddHBand="0" w:evenHBand="0" w:firstRowFirstColumn="0" w:firstRowLastColumn="0" w:lastRowFirstColumn="0" w:lastRowLastColumn="0"/>
@@ -1264,7 +1280,7 @@
               <w:br/>
             </w:r>
           </w:p>
-          <w:p>
+          <w:p ns2:paraId="2A75EDB8" ns2:textId="090706D0">
             <w:pPr>
               <w:spacing w:line="276" w:lineRule="auto"/>
               <w:ind w:left="-111" w:firstLine="111"/>
@@ -1296,7 +1312,7 @@
               </w:rPr>
               <w:t xml:space="preserve"> </w:t>
             </w:r>
-            <w:hyperlink r:id="rId10" w:history="1">
+            <w:hyperlink ns7:id="rId10" w:history="1">
               <w:r>
                 <w:rPr>
                   <w:rStyle w:val="Hipercze"/>
@@ -1311,7 +1327,7 @@
           </w:p>
         </w:tc>
       </w:tr>
-      <w:tr>
+      <w:tr ns2:paraId="097B4CFE" ns2:textId="77777777">
         <w:trPr>
           <w:trHeight w:val="76"/>
         </w:trPr>
@@ -1323,11 +1339,11 @@
             <w:vMerge w:val="restart"/>
             <w:tcBorders>
               <w:left w:val="single" w:sz="2" w:space="0" w:color="9CC2E5" w:themeColor="accent5" w:themeTint="99"/>
-              <w:right w:val="nil"/>
+              <w:right w:val="single" w:sz="2" w:space="0" w:color="9CC2E5" w:themeColor="accent5" w:themeTint="99"/>
             </w:tcBorders>
             <w:shd w:val="clear" w:color="auto" w:fill="auto"/>
           </w:tcPr>
-          <w:p>
+          <w:p ns2:paraId="5910D601" ns2:textId="77777777">
             <w:pPr>
               <w:spacing w:line="276" w:lineRule="auto"/>
               <w:rPr>
@@ -1341,7 +1357,7 @@
               </w:rPr>
             </w:pPr>
           </w:p>
-          <w:p>
+          <w:p ns2:paraId="24BB6E43" ns2:textId="047B69B1">
             <w:pPr>
               <w:spacing w:line="276" w:lineRule="auto"/>
               <w:rPr>
@@ -1386,7 +1402,7 @@
               <w:t xml:space="preserve"> </w:t>
             </w:r>
           </w:p>
-          <w:p>
+          <w:p ns2:paraId="3168C804" ns2:textId="0D92539E">
             <w:pPr>
               <w:spacing w:line="276" w:lineRule="auto"/>
               <w:rPr>
@@ -1430,7 +1446,7 @@
               <w:bottom w:val="nil"/>
             </w:tcBorders>
           </w:tcPr>
-          <w:p>
+          <w:p ns2:paraId="1BCE123A" ns2:textId="77777777">
             <w:pPr>
               <w:cnfStyle w:val="000000000000" w:firstRow="0" w:lastRow="0" w:firstColumn="0" w:lastColumn="0" w:oddVBand="0" w:evenVBand="0" w:oddHBand="0" w:evenHBand="0" w:firstRowFirstColumn="0" w:firstRowLastColumn="0" w:lastRowFirstColumn="0" w:lastRowLastColumn="0"/>
               <w:rPr>
@@ -1446,10 +1462,11 @@
             <w:gridSpan w:val="3"/>
             <w:tcBorders>
               <w:bottom w:val="single" w:sz="2" w:space="0" w:color="9CC2E5" w:themeColor="accent5" w:themeTint="99"/>
+              <w:left w:val="single" w:sz="2" w:space="0" w:color="9CC2E5" w:themeColor="accent5" w:themeTint="99"/>
             </w:tcBorders>
             <w:shd w:val="clear" w:color="auto" w:fill="0070C0"/>
           </w:tcPr>
-          <w:p>
+          <w:p ns2:paraId="4B9E0D91" ns2:textId="77777777">
             <w:pPr>
               <w:ind w:firstLine="15"/>
               <w:jc w:val="center"/>
@@ -1473,7 +1490,7 @@
           </w:p>
         </w:tc>
       </w:tr>
-      <w:tr>
+      <w:tr ns2:paraId="6A5BD3DC" ns2:textId="77777777">
         <w:trPr>
           <w:trHeight w:val="410"/>
         </w:trPr>
@@ -1486,11 +1503,11 @@
             <w:tcBorders>
               <w:left w:val="single" w:sz="2" w:space="0" w:color="9CC2E5" w:themeColor="accent5" w:themeTint="99"/>
               <w:bottom w:val="single" w:sz="2" w:space="0" w:color="9CC2E5" w:themeColor="accent5" w:themeTint="99"/>
-              <w:right w:val="nil"/>
+              <w:right w:val="single" w:sz="2" w:space="0" w:color="9CC2E5" w:themeColor="accent5" w:themeTint="99"/>
             </w:tcBorders>
             <w:shd w:val="clear" w:color="auto" w:fill="auto"/>
           </w:tcPr>
-          <w:p>
+          <w:p ns2:paraId="5A457387" ns2:textId="77777777">
             <w:pPr>
               <w:rPr>
                 <w:rFonts w:ascii="Calibri" w:hAnsi="Calibri"/>
@@ -1510,7 +1527,7 @@
               <w:bottom w:val="nil"/>
             </w:tcBorders>
           </w:tcPr>
-          <w:p>
+          <w:p ns2:paraId="356DF848" ns2:textId="77777777">
             <w:pPr>
               <w:cnfStyle w:val="000000000000" w:firstRow="0" w:lastRow="0" w:firstColumn="0" w:lastColumn="0" w:oddVBand="0" w:evenVBand="0" w:oddHBand="0" w:evenHBand="0" w:firstRowFirstColumn="0" w:firstRowLastColumn="0" w:lastRowFirstColumn="0" w:lastRowLastColumn="0"/>
               <w:rPr>
@@ -1527,10 +1544,11 @@
             <w:vMerge w:val="restart"/>
             <w:tcBorders>
               <w:bottom w:val="single" w:sz="2" w:space="0" w:color="9CC2E5" w:themeColor="accent5" w:themeTint="99"/>
+              <w:left w:val="single" w:sz="2" w:space="0" w:color="9CC2E5" w:themeColor="accent5" w:themeTint="99"/>
             </w:tcBorders>
             <w:shd w:val="clear" w:color="auto" w:fill="auto"/>
           </w:tcPr>
-          <w:p>
+          <w:p ns2:paraId="6367EF7F" ns2:textId="77777777">
             <w:pPr>
               <w:spacing w:line="360" w:lineRule="auto"/>
               <w:ind w:hanging="4"/>
@@ -1545,7 +1563,7 @@
               </w:rPr>
             </w:pPr>
           </w:p>
-          <w:p>
+          <w:p ns2:paraId="56DAADC2" ns2:textId="129B1B03">
             <w:pPr>
               <w:spacing w:line="360" w:lineRule="auto"/>
               <w:ind w:hanging="4"/>
@@ -1615,7 +1633,7 @@
               <w:t>:</w:t>
             </w:r>
           </w:p>
-          <w:p>
+          <w:p ns2:paraId="1E48CFE2" ns2:textId="0E2F123C">
             <w:pPr>
               <w:spacing w:line="360" w:lineRule="auto"/>
               <w:cnfStyle w:val="000000000000" w:firstRow="0" w:lastRow="0" w:firstColumn="0" w:lastColumn="0" w:oddVBand="0" w:evenVBand="0" w:oddHBand="0" w:evenHBand="0" w:firstRowFirstColumn="0" w:firstRowLastColumn="0" w:lastRowFirstColumn="0" w:lastRowLastColumn="0"/>
@@ -1630,7 +1648,7 @@
           </w:p>
         </w:tc>
       </w:tr>
-      <w:tr>
+      <w:tr ns2:paraId="6602F6CD" ns2:textId="77777777">
         <w:trPr>
           <w:trHeight w:val="549"/>
         </w:trPr>
@@ -1642,11 +1660,11 @@
             <w:tcBorders>
               <w:left w:val="single" w:sz="2" w:space="0" w:color="9CC2E5" w:themeColor="accent5" w:themeTint="99"/>
               <w:bottom w:val="single" w:sz="2" w:space="0" w:color="9CC2E5" w:themeColor="accent5" w:themeTint="99"/>
-              <w:right w:val="nil"/>
+              <w:right w:val="single" w:sz="2" w:space="0" w:color="9CC2E5" w:themeColor="accent5" w:themeTint="99"/>
             </w:tcBorders>
             <w:shd w:val="clear" w:color="auto" w:fill="0070C0"/>
           </w:tcPr>
-          <w:p>
+          <w:p ns2:paraId="5FDB990E" ns2:textId="0D0E6151">
             <w:pPr>
               <w:spacing w:before="120"/>
               <w:jc w:val="center"/>
@@ -1684,7 +1702,7 @@
               <w:bottom w:val="nil"/>
             </w:tcBorders>
           </w:tcPr>
-          <w:p>
+          <w:p ns2:paraId="068B8AC7" ns2:textId="77777777">
             <w:pPr>
               <w:cnfStyle w:val="000000000000" w:firstRow="0" w:lastRow="0" w:firstColumn="0" w:lastColumn="0" w:oddVBand="0" w:evenVBand="0" w:oddHBand="0" w:evenHBand="0" w:firstRowFirstColumn="0" w:firstRowLastColumn="0" w:lastRowFirstColumn="0" w:lastRowLastColumn="0"/>
               <w:rPr>
@@ -1701,8 +1719,11 @@
             <w:gridSpan w:val="3"/>
             <w:vMerge/>
             <w:shd w:val="clear" w:color="auto" w:fill="auto"/>
+            <w:tcBorders>
+              <w:left w:val="single" w:sz="2" w:space="0" w:color="9CC2E5" w:themeColor="accent5" w:themeTint="99"/>
+            </w:tcBorders>
           </w:tcPr>
-          <w:p>
+          <w:p ns2:paraId="32579BDB" ns2:textId="77777777">
             <w:pPr>
               <w:cnfStyle w:val="000000000000" w:firstRow="0" w:lastRow="0" w:firstColumn="0" w:lastColumn="0" w:oddVBand="0" w:evenVBand="0" w:oddHBand="0" w:evenHBand="0" w:firstRowFirstColumn="0" w:firstRowLastColumn="0" w:lastRowFirstColumn="0" w:lastRowLastColumn="0"/>
               <w:rPr>
@@ -1714,7 +1735,7 @@
           </w:p>
         </w:tc>
       </w:tr>
-      <w:tr>
+      <w:tr ns2:paraId="318C0D32" ns2:textId="77777777">
         <w:tc>
           <w:tcPr>
             <w:cnfStyle w:val="001000000000" w:firstRow="0" w:lastRow="0" w:firstColumn="1" w:lastColumn="0" w:oddVBand="0" w:evenVBand="0" w:oddHBand="0" w:evenHBand="0" w:firstRowFirstColumn="0" w:firstRowLastColumn="0" w:lastRowFirstColumn="0" w:lastRowLastColumn="0"/>
@@ -1723,10 +1744,10 @@
             <w:tcBorders>
               <w:left w:val="single" w:sz="2" w:space="0" w:color="9CC2E5" w:themeColor="accent5" w:themeTint="99"/>
               <w:bottom w:val="single" w:sz="2" w:space="0" w:color="9CC2E5" w:themeColor="accent5" w:themeTint="99"/>
-              <w:right w:val="nil"/>
+              <w:right w:val="single" w:sz="2" w:space="0" w:color="9CC2E5" w:themeColor="accent5" w:themeTint="99"/>
             </w:tcBorders>
           </w:tcPr>
-          <w:p>
+          <w:p ns2:paraId="1AC2F2F0" ns2:textId="1003EFAC">
             <w:pPr>
               <w:ind w:left="33" w:right="32" w:hanging="33"/>
               <w:jc w:val="both"/>
@@ -1745,11 +1766,11 @@
                   <w:szCs w:val="32"/>
                 </w:rPr>
                 <w:id w:val="1954678923"/>
-                <w14:checkbox>
-                  <w14:checked w14:val="0"/>
-                  <w14:checkedState w14:val="00FE" w14:font="Wingdings"/>
-                  <w14:uncheckedState w14:val="00A8" w14:font="Wingdings"/>
-                </w14:checkbox>
+                <ns2:checkbox>
+                  <ns2:checked ns2:val="0"/>
+                  <ns2:checkedState ns2:val="00FE" ns2:font="Wingdings"/>
+                  <ns2:uncheckedState ns2:val="00A8" ns2:font="Wingdings"/>
+                </ns2:checkbox>
               </w:sdtPr>
               <w:sdtContent>
                 <w:r>
@@ -1820,7 +1841,7 @@
           <w:bookmarkStart w:id="6" w:name="OLE_LINK5"/>
           <w:bookmarkStart w:id="7" w:name="_Hlk181956334"/>
           <w:bookmarkStart w:id="8" w:name="OLE_LINK29"/>
-          <w:p>
+          <w:p ns2:paraId="43EE9A35" ns2:textId="63001A87">
             <w:pPr>
               <w:ind w:left="33" w:right="32" w:hanging="33"/>
               <w:jc w:val="both"/>
@@ -1839,11 +1860,11 @@
                   <w:szCs w:val="32"/>
                 </w:rPr>
                 <w:id w:val="458847706"/>
-                <w14:checkbox>
-                  <w14:checked w14:val="0"/>
-                  <w14:checkedState w14:val="00FE" w14:font="Wingdings"/>
-                  <w14:uncheckedState w14:val="00A8" w14:font="Wingdings"/>
-                </w14:checkbox>
+                <ns2:checkbox>
+                  <ns2:checked ns2:val="0"/>
+                  <ns2:checkedState ns2:val="00FE" ns2:font="Wingdings"/>
+                  <ns2:uncheckedState ns2:val="00A8" ns2:font="Wingdings"/>
+                </ns2:checkbox>
               </w:sdtPr>
               <w:sdtContent>
                 <w:r>
@@ -1944,7 +1965,7 @@
               <w:t xml:space="preserve"> na rachunek Zleceniodawcy</w:t>
             </w:r>
           </w:p>
-          <w:p>
+          <w:p ns2:paraId="6D196442" ns2:textId="2649BB24">
             <w:pPr>
               <w:spacing w:line="276" w:lineRule="auto"/>
               <w:ind w:left="33" w:right="32" w:hanging="33"/>
@@ -1964,11 +1985,11 @@
                   <w:szCs w:val="32"/>
                 </w:rPr>
                 <w:id w:val="-1711104692"/>
-                <w14:checkbox>
-                  <w14:checked w14:val="0"/>
-                  <w14:checkedState w14:val="00FE" w14:font="Wingdings"/>
-                  <w14:uncheckedState w14:val="00A8" w14:font="Wingdings"/>
-                </w14:checkbox>
+                <ns2:checkbox>
+                  <ns2:checked ns2:val="0"/>
+                  <ns2:checkedState ns2:val="00FE" ns2:font="Wingdings"/>
+                  <ns2:uncheckedState ns2:val="00A8" ns2:font="Wingdings"/>
+                </ns2:checkbox>
               </w:sdtPr>
               <w:sdtContent>
                 <w:r>
@@ -2053,7 +2074,7 @@
               <w:t>w ramach założonego budżetu oraz zakup pojazdu przez Zleceniobiorcę na rachunek Zleceniodawcy z finansowania (leasing, kredyt lub płatność odroczona)</w:t>
             </w:r>
           </w:p>
-          <w:p>
+          <w:p ns2:paraId="022821EE" ns2:textId="78121D89">
             <w:pPr>
               <w:ind w:left="33" w:right="32" w:hanging="33"/>
               <w:jc w:val="both"/>
@@ -2072,11 +2093,11 @@
                   <w:szCs w:val="32"/>
                 </w:rPr>
                 <w:id w:val="-1872908078"/>
-                <w14:checkbox>
-                  <w14:checked w14:val="0"/>
-                  <w14:checkedState w14:val="00FE" w14:font="Wingdings"/>
-                  <w14:uncheckedState w14:val="00A8" w14:font="Wingdings"/>
-                </w14:checkbox>
+                <ns2:checkbox>
+                  <ns2:checked ns2:val="0"/>
+                  <ns2:checkedState ns2:val="00FE" ns2:font="Wingdings"/>
+                  <ns2:uncheckedState ns2:val="00A8" ns2:font="Wingdings"/>
+                </ns2:checkbox>
               </w:sdtPr>
               <w:sdtContent>
                 <w:r>
@@ -2193,7 +2214,7 @@
               <w:bottom w:val="nil"/>
             </w:tcBorders>
           </w:tcPr>
-          <w:p>
+          <w:p ns2:paraId="58AA54CB" ns2:textId="77777777">
             <w:pPr>
               <w:cnfStyle w:val="000000000000" w:firstRow="0" w:lastRow="0" w:firstColumn="0" w:lastColumn="0" w:oddVBand="0" w:evenVBand="0" w:oddHBand="0" w:evenHBand="0" w:firstRowFirstColumn="0" w:firstRowLastColumn="0" w:lastRowFirstColumn="0" w:lastRowLastColumn="0"/>
             </w:pPr>
@@ -2205,10 +2226,11 @@
             <w:gridSpan w:val="3"/>
             <w:tcBorders>
               <w:bottom w:val="single" w:sz="2" w:space="0" w:color="9CC2E5" w:themeColor="accent5" w:themeTint="99"/>
+              <w:left w:val="single" w:sz="2" w:space="0" w:color="9CC2E5" w:themeColor="accent5" w:themeTint="99"/>
             </w:tcBorders>
             <w:shd w:val="clear" w:color="auto" w:fill="auto"/>
           </w:tcPr>
-          <w:p>
+          <w:p ns2:paraId="064386AF" ns2:textId="77777777">
             <w:pPr>
               <w:cnfStyle w:val="000000000000" w:firstRow="0" w:lastRow="0" w:firstColumn="0" w:lastColumn="0" w:oddVBand="0" w:evenVBand="0" w:oddHBand="0" w:evenHBand="0" w:firstRowFirstColumn="0" w:firstRowLastColumn="0" w:lastRowFirstColumn="0" w:lastRowLastColumn="0"/>
               <w:rPr>
@@ -2221,7 +2243,7 @@
               </w:rPr>
             </w:pPr>
           </w:p>
-          <w:p>
+          <w:p ns2:paraId="1983C578" ns2:textId="7375B8E8">
             <w:pPr>
               <w:cnfStyle w:val="000000000000" w:firstRow="0" w:lastRow="0" w:firstColumn="0" w:lastColumn="0" w:oddVBand="0" w:evenVBand="0" w:oddHBand="0" w:evenHBand="0" w:firstRowFirstColumn="0" w:firstRowLastColumn="0" w:lastRowFirstColumn="0" w:lastRowLastColumn="0"/>
               <w:rPr>
@@ -2256,7 +2278,7 @@
               <w:t>paliwo:</w:t>
             </w:r>
           </w:p>
-          <w:p>
+          <w:p ns2:paraId="6F3B4F47" ns2:textId="7BD9B9F6">
             <w:pPr>
               <w:ind w:right="-183"/>
               <w:cnfStyle w:val="000000000000" w:firstRow="0" w:lastRow="0" w:firstColumn="0" w:lastColumn="0" w:oddVBand="0" w:evenVBand="0" w:oddHBand="0" w:evenHBand="0" w:firstRowFirstColumn="0" w:firstRowLastColumn="0" w:lastRowFirstColumn="0" w:lastRowLastColumn="0"/>
@@ -2275,11 +2297,11 @@
                   <w:szCs w:val="36"/>
                 </w:rPr>
                 <w:id w:val="-1506432622"/>
-                <w14:checkbox>
-                  <w14:checked w14:val="0"/>
-                  <w14:checkedState w14:val="00FE" w14:font="Wingdings"/>
-                  <w14:uncheckedState w14:val="00A8" w14:font="Wingdings"/>
-                </w14:checkbox>
+                <ns2:checkbox>
+                  <ns2:checked ns2:val="0"/>
+                  <ns2:checkedState ns2:val="00FE" ns2:font="Wingdings"/>
+                  <ns2:uncheckedState ns2:val="00A8" ns2:font="Wingdings"/>
+                </ns2:checkbox>
               </w:sdtPr>
               <w:sdtContent>
                 <w:r>
@@ -2334,11 +2356,11 @@
                   <w:szCs w:val="36"/>
                 </w:rPr>
                 <w:id w:val="1331096373"/>
-                <w14:checkbox>
-                  <w14:checked w14:val="0"/>
-                  <w14:checkedState w14:val="00FE" w14:font="Wingdings"/>
-                  <w14:uncheckedState w14:val="00A8" w14:font="Wingdings"/>
-                </w14:checkbox>
+                <ns2:checkbox>
+                  <ns2:checked ns2:val="0"/>
+                  <ns2:checkedState ns2:val="00FE" ns2:font="Wingdings"/>
+                  <ns2:uncheckedState ns2:val="00A8" ns2:font="Wingdings"/>
+                </ns2:checkbox>
               </w:sdtPr>
               <w:sdtContent>
                 <w:r>
@@ -2393,11 +2415,11 @@
                   <w:szCs w:val="36"/>
                 </w:rPr>
                 <w:id w:val="-1041282422"/>
-                <w14:checkbox>
-                  <w14:checked w14:val="0"/>
-                  <w14:checkedState w14:val="00FE" w14:font="Wingdings"/>
-                  <w14:uncheckedState w14:val="00A8" w14:font="Wingdings"/>
-                </w14:checkbox>
+                <ns2:checkbox>
+                  <ns2:checked ns2:val="0"/>
+                  <ns2:checkedState ns2:val="00FE" ns2:font="Wingdings"/>
+                  <ns2:uncheckedState ns2:val="00A8" ns2:font="Wingdings"/>
+                </ns2:checkbox>
               </w:sdtPr>
               <w:sdtContent>
                 <w:r>
@@ -2447,11 +2469,11 @@
                   <w:szCs w:val="36"/>
                 </w:rPr>
                 <w:id w:val="-1615976413"/>
-                <w14:checkbox>
-                  <w14:checked w14:val="0"/>
-                  <w14:checkedState w14:val="00FE" w14:font="Wingdings"/>
-                  <w14:uncheckedState w14:val="00A8" w14:font="Wingdings"/>
-                </w14:checkbox>
+                <ns2:checkbox>
+                  <ns2:checked ns2:val="0"/>
+                  <ns2:checkedState ns2:val="00FE" ns2:font="Wingdings"/>
+                  <ns2:uncheckedState ns2:val="00A8" ns2:font="Wingdings"/>
+                </ns2:checkbox>
               </w:sdtPr>
               <w:sdtContent>
                 <w:r>
@@ -2483,7 +2505,7 @@
               <w:t>elektryk</w:t>
             </w:r>
           </w:p>
-          <w:p>
+          <w:p ns2:paraId="2CFF54EE" ns2:textId="77777777">
             <w:pPr>
               <w:cnfStyle w:val="000000000000" w:firstRow="0" w:lastRow="0" w:firstColumn="0" w:lastColumn="0" w:oddVBand="0" w:evenVBand="0" w:oddHBand="0" w:evenHBand="0" w:firstRowFirstColumn="0" w:firstRowLastColumn="0" w:lastRowFirstColumn="0" w:lastRowLastColumn="0"/>
               <w:rPr>
@@ -2499,7 +2521,7 @@
             <w:bookmarkStart w:id="11" w:name="OLE_LINK13"/>
             <w:bookmarkStart w:id="12" w:name="OLE_LINK14"/>
           </w:p>
-          <w:p>
+          <w:p ns2:paraId="551863EC" ns2:textId="2E37C7F9">
             <w:pPr>
               <w:cnfStyle w:val="000000000000" w:firstRow="0" w:lastRow="0" w:firstColumn="0" w:lastColumn="0" w:oddVBand="0" w:evenVBand="0" w:oddHBand="0" w:evenHBand="0" w:firstRowFirstColumn="0" w:firstRowLastColumn="0" w:lastRowFirstColumn="0" w:lastRowLastColumn="0"/>
               <w:rPr>
@@ -2531,7 +2553,7 @@
               <w:t xml:space="preserve"> </w:t>
             </w:r>
           </w:p>
-          <w:p>
+          <w:p ns2:paraId="515D49F5" ns2:textId="187C03B5">
             <w:pPr>
               <w:cnfStyle w:val="000000000000" w:firstRow="0" w:lastRow="0" w:firstColumn="0" w:lastColumn="0" w:oddVBand="0" w:evenVBand="0" w:oddHBand="0" w:evenHBand="0" w:firstRowFirstColumn="0" w:firstRowLastColumn="0" w:lastRowFirstColumn="0" w:lastRowLastColumn="0"/>
               <w:rPr>
@@ -2551,11 +2573,11 @@
                   <w:szCs w:val="36"/>
                 </w:rPr>
                 <w:id w:val="-1653675602"/>
-                <w14:checkbox>
-                  <w14:checked w14:val="0"/>
-                  <w14:checkedState w14:val="00FE" w14:font="Wingdings"/>
-                  <w14:uncheckedState w14:val="00A8" w14:font="Wingdings"/>
-                </w14:checkbox>
+                <ns2:checkbox>
+                  <ns2:checked ns2:val="0"/>
+                  <ns2:checkedState ns2:val="00FE" ns2:font="Wingdings"/>
+                  <ns2:uncheckedState ns2:val="00A8" ns2:font="Wingdings"/>
+                </ns2:checkbox>
               </w:sdtPr>
               <w:sdtContent>
                 <w:r>
@@ -2603,11 +2625,11 @@
                   <w:szCs w:val="36"/>
                 </w:rPr>
                 <w:id w:val="480277447"/>
-                <w14:checkbox>
-                  <w14:checked w14:val="0"/>
-                  <w14:checkedState w14:val="00FE" w14:font="Wingdings"/>
-                  <w14:uncheckedState w14:val="00A8" w14:font="Wingdings"/>
-                </w14:checkbox>
+                <ns2:checkbox>
+                  <ns2:checked ns2:val="0"/>
+                  <ns2:checkedState ns2:val="00FE" ns2:font="Wingdings"/>
+                  <ns2:uncheckedState ns2:val="00A8" ns2:font="Wingdings"/>
+                </ns2:checkbox>
               </w:sdtPr>
               <w:sdtContent>
                 <w:r>
@@ -2645,7 +2667,7 @@
               <w:t>yczna</w:t>
             </w:r>
           </w:p>
-          <w:p>
+          <w:p ns2:paraId="27497AF3" ns2:textId="77777777">
             <w:pPr>
               <w:cnfStyle w:val="000000000000" w:firstRow="0" w:lastRow="0" w:firstColumn="0" w:lastColumn="0" w:oddVBand="0" w:evenVBand="0" w:oddHBand="0" w:evenHBand="0" w:firstRowFirstColumn="0" w:firstRowLastColumn="0" w:lastRowFirstColumn="0" w:lastRowLastColumn="0"/>
               <w:rPr>
@@ -2658,7 +2680,7 @@
           </w:p>
           <w:bookmarkEnd w:id="11"/>
           <w:bookmarkEnd w:id="12"/>
-          <w:p>
+          <w:p ns2:paraId="0BD649ED" ns2:textId="77777777">
             <w:pPr>
               <w:cnfStyle w:val="000000000000" w:firstRow="0" w:lastRow="0" w:firstColumn="0" w:lastColumn="0" w:oddVBand="0" w:evenVBand="0" w:oddHBand="0" w:evenHBand="0" w:firstRowFirstColumn="0" w:firstRowLastColumn="0" w:lastRowFirstColumn="0" w:lastRowLastColumn="0"/>
               <w:rPr>
@@ -2682,7 +2704,7 @@
               <w:t>Norma spalania euro:</w:t>
             </w:r>
           </w:p>
-          <w:p>
+          <w:p ns2:paraId="10C004FD" ns2:textId="0026D50F">
             <w:pPr>
               <w:cnfStyle w:val="000000000000" w:firstRow="0" w:lastRow="0" w:firstColumn="0" w:lastColumn="0" w:oddVBand="0" w:evenVBand="0" w:oddHBand="0" w:evenHBand="0" w:firstRowFirstColumn="0" w:firstRowLastColumn="0" w:lastRowFirstColumn="0" w:lastRowLastColumn="0"/>
               <w:rPr>
@@ -2710,11 +2732,11 @@
                   <w:szCs w:val="36"/>
                 </w:rPr>
                 <w:id w:val="69850196"/>
-                <w14:checkbox>
-                  <w14:checked w14:val="0"/>
-                  <w14:checkedState w14:val="00FE" w14:font="Wingdings"/>
-                  <w14:uncheckedState w14:val="00A8" w14:font="Wingdings"/>
-                </w14:checkbox>
+                <ns2:checkbox>
+                  <ns2:checked ns2:val="0"/>
+                  <ns2:checkedState ns2:val="00FE" ns2:font="Wingdings"/>
+                  <ns2:uncheckedState ns2:val="00A8" ns2:font="Wingdings"/>
+                </ns2:checkbox>
               </w:sdtPr>
               <w:sdtContent>
                 <w:r>
@@ -2770,11 +2792,11 @@
                   <w:szCs w:val="36"/>
                 </w:rPr>
                 <w:id w:val="194812198"/>
-                <w14:checkbox>
-                  <w14:checked w14:val="0"/>
-                  <w14:checkedState w14:val="00FE" w14:font="Wingdings"/>
-                  <w14:uncheckedState w14:val="00A8" w14:font="Wingdings"/>
-                </w14:checkbox>
+                <ns2:checkbox>
+                  <ns2:checked ns2:val="0"/>
+                  <ns2:checkedState ns2:val="00FE" ns2:font="Wingdings"/>
+                  <ns2:uncheckedState ns2:val="00A8" ns2:font="Wingdings"/>
+                </ns2:checkbox>
               </w:sdtPr>
               <w:sdtContent>
                 <w:r>
@@ -2825,11 +2847,11 @@
                   <w:szCs w:val="36"/>
                 </w:rPr>
                 <w:id w:val="-545988898"/>
-                <w14:checkbox>
-                  <w14:checked w14:val="0"/>
-                  <w14:checkedState w14:val="00FE" w14:font="Wingdings"/>
-                  <w14:uncheckedState w14:val="00A8" w14:font="Wingdings"/>
-                </w14:checkbox>
+                <ns2:checkbox>
+                  <ns2:checked ns2:val="0"/>
+                  <ns2:checkedState ns2:val="00FE" ns2:font="Wingdings"/>
+                  <ns2:uncheckedState ns2:val="00A8" ns2:font="Wingdings"/>
+                </ns2:checkbox>
               </w:sdtPr>
               <w:sdtContent>
                 <w:r>
@@ -2873,11 +2895,11 @@
                   <w:szCs w:val="36"/>
                 </w:rPr>
                 <w:id w:val="-1960797459"/>
-                <w14:checkbox>
-                  <w14:checked w14:val="0"/>
-                  <w14:checkedState w14:val="00FE" w14:font="Wingdings"/>
-                  <w14:uncheckedState w14:val="00A8" w14:font="Wingdings"/>
-                </w14:checkbox>
+                <ns2:checkbox>
+                  <ns2:checked ns2:val="0"/>
+                  <ns2:checkedState ns2:val="00FE" ns2:font="Wingdings"/>
+                  <ns2:uncheckedState ns2:val="00A8" ns2:font="Wingdings"/>
+                </ns2:checkbox>
               </w:sdtPr>
               <w:sdtContent>
                 <w:r>
@@ -2920,7 +2942,7 @@
           </w:p>
         </w:tc>
       </w:tr>
-      <w:tr>
+      <w:tr ns2:paraId="15E2672F" ns2:textId="77777777">
         <w:trPr>
           <w:trHeight w:val="353"/>
         </w:trPr>
@@ -2932,11 +2954,11 @@
             <w:tcBorders>
               <w:left w:val="single" w:sz="2" w:space="0" w:color="9CC2E5" w:themeColor="accent5" w:themeTint="99"/>
               <w:bottom w:val="single" w:sz="2" w:space="0" w:color="9CC2E5" w:themeColor="accent5" w:themeTint="99"/>
-              <w:right w:val="nil"/>
+              <w:right w:val="single" w:sz="2" w:space="0" w:color="9CC2E5" w:themeColor="accent5" w:themeTint="99"/>
             </w:tcBorders>
             <w:shd w:val="clear" w:color="auto" w:fill="2E74B5" w:themeFill="accent5" w:themeFillShade="BF"/>
           </w:tcPr>
-          <w:p>
+          <w:p ns2:paraId="64E2F2E1" ns2:textId="0BAF5984">
             <w:pPr>
               <w:jc w:val="center"/>
               <w:rPr>
@@ -3115,7 +3137,7 @@
                 <w:sz w:val="15"/>
                 <w:szCs w:val="15"/>
               </w:rPr>
-              <w:t xml:space="preserve">zadatku, </w:t>
+              <w:t xml:space="preserve">zaliczki, </w:t>
             </w:r>
             <w:r>
               <w:rPr>
@@ -3173,7 +3195,7 @@
               <w:bottom w:val="nil"/>
             </w:tcBorders>
           </w:tcPr>
-          <w:p>
+          <w:p ns2:paraId="718C9905" ns2:textId="77777777">
             <w:pPr>
               <w:cnfStyle w:val="000000000000" w:firstRow="0" w:lastRow="0" w:firstColumn="0" w:lastColumn="0" w:oddVBand="0" w:evenVBand="0" w:oddHBand="0" w:evenHBand="0" w:firstRowFirstColumn="0" w:firstRowLastColumn="0" w:lastRowFirstColumn="0" w:lastRowLastColumn="0"/>
             </w:pPr>
@@ -3184,8 +3206,11 @@
             <w:tcW w:w="4819" w:type="dxa"/>
             <w:gridSpan w:val="3"/>
             <w:shd w:val="clear" w:color="auto" w:fill="auto"/>
+            <w:tcBorders>
+              <w:left w:val="single" w:sz="2" w:space="0" w:color="9CC2E5" w:themeColor="accent5" w:themeTint="99"/>
+            </w:tcBorders>
           </w:tcPr>
-          <w:p>
+          <w:p ns2:paraId="7A1B9354" ns2:textId="77777777">
             <w:pPr>
               <w:spacing w:line="276" w:lineRule="auto"/>
               <w:cnfStyle w:val="000000000000" w:firstRow="0" w:lastRow="0" w:firstColumn="0" w:lastColumn="0" w:oddVBand="0" w:evenVBand="0" w:oddHBand="0" w:evenHBand="0" w:firstRowFirstColumn="0" w:firstRowLastColumn="0" w:lastRowFirstColumn="0" w:lastRowLastColumn="0"/>
@@ -3199,7 +3224,7 @@
               </w:rPr>
             </w:pPr>
           </w:p>
-          <w:p>
+          <w:p ns2:paraId="60C0FDC5" ns2:textId="77777777">
             <w:pPr>
               <w:spacing w:line="276" w:lineRule="auto"/>
               <w:cnfStyle w:val="000000000000" w:firstRow="0" w:lastRow="0" w:firstColumn="0" w:lastColumn="0" w:oddVBand="0" w:evenVBand="0" w:oddHBand="0" w:evenHBand="0" w:firstRowFirstColumn="0" w:firstRowLastColumn="0" w:lastRowFirstColumn="0" w:lastRowLastColumn="0"/>
@@ -3213,7 +3238,7 @@
               </w:rPr>
             </w:pPr>
           </w:p>
-          <w:p>
+          <w:p ns2:paraId="39D75B9D" ns2:textId="2ADCD9AB">
             <w:pPr>
               <w:spacing w:line="276" w:lineRule="auto"/>
               <w:cnfStyle w:val="000000000000" w:firstRow="0" w:lastRow="0" w:firstColumn="0" w:lastColumn="0" w:oddVBand="0" w:evenVBand="0" w:oddHBand="0" w:evenHBand="0" w:firstRowFirstColumn="0" w:firstRowLastColumn="0" w:lastRowFirstColumn="0" w:lastRowLastColumn="0"/>
@@ -3300,7 +3325,7 @@
           </w:p>
         </w:tc>
       </w:tr>
-      <w:tr>
+      <w:tr ns2:paraId="060FB63D" ns2:textId="77777777">
         <w:trPr>
           <w:trHeight w:val="619"/>
         </w:trPr>
@@ -3313,11 +3338,11 @@
               <w:top w:val="single" w:sz="2" w:space="0" w:color="9CC2E5" w:themeColor="accent5" w:themeTint="99"/>
               <w:left w:val="single" w:sz="2" w:space="0" w:color="9CC2E5" w:themeColor="accent5" w:themeTint="99"/>
               <w:bottom w:val="single" w:sz="2" w:space="0" w:color="9CC2E5" w:themeColor="accent5" w:themeTint="99"/>
-              <w:right w:val="nil"/>
+              <w:right w:val="single" w:sz="2" w:space="0" w:color="9CC2E5" w:themeColor="accent5" w:themeTint="99"/>
             </w:tcBorders>
             <w:shd w:val="clear" w:color="auto" w:fill="auto"/>
           </w:tcPr>
-          <w:p>
+          <w:p ns2:paraId="5C3F36F2" ns2:textId="77777777">
             <w:pPr>
               <w:rPr>
                 <w:rFonts w:ascii="Calibri" w:hAnsi="Calibri"/>
@@ -3329,7 +3354,7 @@
               </w:rPr>
             </w:pPr>
           </w:p>
-          <w:p>
+          <w:p ns2:paraId="299D450D" ns2:textId="101FDD12">
             <w:pPr>
               <w:rPr>
                 <w:rFonts w:ascii="Calibri" w:hAnsi="Calibri"/>
@@ -3386,7 +3411,7 @@
               <w:bottom w:val="nil"/>
             </w:tcBorders>
           </w:tcPr>
-          <w:p>
+          <w:p ns2:paraId="116EC86F" ns2:textId="77777777">
             <w:pPr>
               <w:cnfStyle w:val="000000000000" w:firstRow="0" w:lastRow="0" w:firstColumn="0" w:lastColumn="0" w:oddVBand="0" w:evenVBand="0" w:oddHBand="0" w:evenHBand="0" w:firstRowFirstColumn="0" w:firstRowLastColumn="0" w:lastRowFirstColumn="0" w:lastRowLastColumn="0"/>
             </w:pPr>
@@ -3396,8 +3421,11 @@
           <w:tcPr>
             <w:tcW w:w="4819" w:type="dxa"/>
             <w:gridSpan w:val="3"/>
+            <w:tcBorders>
+              <w:left w:val="single" w:sz="2" w:space="0" w:color="9CC2E5" w:themeColor="accent5" w:themeTint="99"/>
+            </w:tcBorders>
           </w:tcPr>
-          <w:p>
+          <w:p ns2:paraId="55D20E45" ns2:textId="77777777">
             <w:pPr>
               <w:ind w:left="-111" w:firstLine="111"/>
               <w:cnfStyle w:val="000000000000" w:firstRow="0" w:lastRow="0" w:firstColumn="0" w:lastColumn="0" w:oddVBand="0" w:evenVBand="0" w:oddHBand="0" w:evenHBand="0" w:firstRowFirstColumn="0" w:firstRowLastColumn="0" w:lastRowFirstColumn="0" w:lastRowLastColumn="0"/>
@@ -3411,7 +3439,7 @@
               </w:rPr>
             </w:pPr>
           </w:p>
-          <w:p>
+          <w:p ns2:paraId="6339FD30" ns2:textId="77777777">
             <w:pPr>
               <w:ind w:left="-111" w:firstLine="111"/>
               <w:cnfStyle w:val="000000000000" w:firstRow="0" w:lastRow="0" w:firstColumn="0" w:lastColumn="0" w:oddVBand="0" w:evenVBand="0" w:oddHBand="0" w:evenHBand="0" w:firstRowFirstColumn="0" w:firstRowLastColumn="0" w:lastRowFirstColumn="0" w:lastRowLastColumn="0"/>
@@ -3425,7 +3453,7 @@
               </w:rPr>
             </w:pPr>
           </w:p>
-          <w:p>
+          <w:p ns2:paraId="53F55A77" ns2:textId="4CD6FA50">
             <w:pPr>
               <w:ind w:left="-111" w:firstLine="111"/>
               <w:cnfStyle w:val="000000000000" w:firstRow="0" w:lastRow="0" w:firstColumn="0" w:lastColumn="0" w:oddVBand="0" w:evenVBand="0" w:oddHBand="0" w:evenHBand="0" w:firstRowFirstColumn="0" w:firstRowLastColumn="0" w:lastRowFirstColumn="0" w:lastRowLastColumn="0"/>
@@ -3502,7 +3530,7 @@
               <w:t>:</w:t>
             </w:r>
           </w:p>
-          <w:p>
+          <w:p ns2:paraId="04532DC6" ns2:textId="2DD30942">
             <w:pPr>
               <w:ind w:left="-111" w:firstLine="111"/>
               <w:cnfStyle w:val="000000000000" w:firstRow="0" w:lastRow="0" w:firstColumn="0" w:lastColumn="0" w:oddVBand="0" w:evenVBand="0" w:oddHBand="0" w:evenHBand="0" w:firstRowFirstColumn="0" w:firstRowLastColumn="0" w:lastRowFirstColumn="0" w:lastRowLastColumn="0"/>
@@ -3515,7 +3543,7 @@
           </w:p>
         </w:tc>
       </w:tr>
-      <w:tr>
+      <w:tr ns2:paraId="45DEC5EC" ns2:textId="77777777">
         <w:trPr>
           <w:trHeight w:val="647"/>
         </w:trPr>
@@ -3527,11 +3555,11 @@
             <w:tcBorders>
               <w:left w:val="single" w:sz="2" w:space="0" w:color="9CC2E5" w:themeColor="accent5" w:themeTint="99"/>
               <w:bottom w:val="single" w:sz="2" w:space="0" w:color="9CC2E5" w:themeColor="accent5" w:themeTint="99"/>
-              <w:right w:val="nil"/>
+              <w:right w:val="single" w:sz="2" w:space="0" w:color="9CC2E5" w:themeColor="accent5" w:themeTint="99"/>
             </w:tcBorders>
             <w:shd w:val="clear" w:color="auto" w:fill="auto"/>
           </w:tcPr>
-          <w:p>
+          <w:p ns2:paraId="7515082E" ns2:textId="77777777">
             <w:pPr>
               <w:ind w:right="-183"/>
               <w:rPr>
@@ -3544,7 +3572,7 @@
               </w:rPr>
             </w:pPr>
           </w:p>
-          <w:p>
+          <w:p ns2:paraId="52EF1FB3" ns2:textId="5498A87D">
             <w:pPr>
               <w:ind w:right="-183"/>
               <w:rPr>
@@ -3590,7 +3618,7 @@
               <w:bottom w:val="nil"/>
             </w:tcBorders>
           </w:tcPr>
-          <w:p>
+          <w:p ns2:paraId="3A9FFFC0" ns2:textId="77777777">
             <w:pPr>
               <w:cnfStyle w:val="000000000000" w:firstRow="0" w:lastRow="0" w:firstColumn="0" w:lastColumn="0" w:oddVBand="0" w:evenVBand="0" w:oddHBand="0" w:evenHBand="0" w:firstRowFirstColumn="0" w:firstRowLastColumn="0" w:lastRowFirstColumn="0" w:lastRowLastColumn="0"/>
             </w:pPr>
@@ -3600,8 +3628,11 @@
           <w:tcPr>
             <w:tcW w:w="4819" w:type="dxa"/>
             <w:gridSpan w:val="3"/>
+            <w:tcBorders>
+              <w:left w:val="single" w:sz="2" w:space="0" w:color="9CC2E5" w:themeColor="accent5" w:themeTint="99"/>
+            </w:tcBorders>
           </w:tcPr>
-          <w:p>
+          <w:p ns2:paraId="27234DE8" ns2:textId="77C0D777">
             <w:pPr>
               <w:cnfStyle w:val="000000000000" w:firstRow="0" w:lastRow="0" w:firstColumn="0" w:lastColumn="0" w:oddVBand="0" w:evenVBand="0" w:oddHBand="0" w:evenHBand="0" w:firstRowFirstColumn="0" w:firstRowLastColumn="0" w:lastRowFirstColumn="0" w:lastRowLastColumn="0"/>
               <w:rPr>
@@ -3638,11 +3669,11 @@
                   <w:szCs w:val="28"/>
                 </w:rPr>
                 <w:id w:val="587814909"/>
-                <w14:checkbox>
-                  <w14:checked w14:val="0"/>
-                  <w14:checkedState w14:val="00FE" w14:font="Wingdings"/>
-                  <w14:uncheckedState w14:val="00A8" w14:font="Wingdings"/>
-                </w14:checkbox>
+                <ns2:checkbox>
+                  <ns2:checked ns2:val="0"/>
+                  <ns2:checkedState ns2:val="00FE" ns2:font="Wingdings"/>
+                  <ns2:uncheckedState ns2:val="00A8" ns2:font="Wingdings"/>
+                </ns2:checkbox>
               </w:sdtPr>
               <w:sdtContent>
                 <w:r>
@@ -3673,11 +3704,11 @@
                   <w:szCs w:val="28"/>
                 </w:rPr>
                 <w:id w:val="-1341227838"/>
-                <w14:checkbox>
-                  <w14:checked w14:val="0"/>
-                  <w14:checkedState w14:val="00FE" w14:font="Wingdings"/>
-                  <w14:uncheckedState w14:val="00A8" w14:font="Wingdings"/>
-                </w14:checkbox>
+                <ns2:checkbox>
+                  <ns2:checked ns2:val="0"/>
+                  <ns2:checkedState ns2:val="00FE" ns2:font="Wingdings"/>
+                  <ns2:uncheckedState ns2:val="00A8" ns2:font="Wingdings"/>
+                </ns2:checkbox>
               </w:sdtPr>
               <w:sdtContent>
                 <w:r>
@@ -3716,11 +3747,11 @@
                   <w:szCs w:val="28"/>
                 </w:rPr>
                 <w:id w:val="1797727126"/>
-                <w14:checkbox>
-                  <w14:checked w14:val="0"/>
-                  <w14:checkedState w14:val="00FE" w14:font="Wingdings"/>
-                  <w14:uncheckedState w14:val="00A8" w14:font="Wingdings"/>
-                </w14:checkbox>
+                <ns2:checkbox>
+                  <ns2:checked ns2:val="0"/>
+                  <ns2:checkedState ns2:val="00FE" ns2:font="Wingdings"/>
+                  <ns2:uncheckedState ns2:val="00A8" ns2:font="Wingdings"/>
+                </ns2:checkbox>
               </w:sdtPr>
               <w:sdtContent>
                 <w:r>
@@ -3762,11 +3793,11 @@
                   <w:szCs w:val="28"/>
                 </w:rPr>
                 <w:id w:val="644169752"/>
-                <w14:checkbox>
-                  <w14:checked w14:val="0"/>
-                  <w14:checkedState w14:val="00FE" w14:font="Wingdings"/>
-                  <w14:uncheckedState w14:val="00A8" w14:font="Wingdings"/>
-                </w14:checkbox>
+                <ns2:checkbox>
+                  <ns2:checked ns2:val="0"/>
+                  <ns2:checkedState ns2:val="00FE" ns2:font="Wingdings"/>
+                  <ns2:uncheckedState ns2:val="00A8" ns2:font="Wingdings"/>
+                </ns2:checkbox>
               </w:sdtPr>
               <w:sdtContent>
                 <w:r>
@@ -3797,7 +3828,7 @@
               <w:t xml:space="preserve"> </w:t>
             </w:r>
           </w:p>
-          <w:p>
+          <w:p ns2:paraId="10707901" ns2:textId="6465863C">
             <w:pPr>
               <w:ind w:left="-111" w:firstLine="111"/>
               <w:cnfStyle w:val="000000000000" w:firstRow="0" w:lastRow="0" w:firstColumn="0" w:lastColumn="0" w:oddVBand="0" w:evenVBand="0" w:oddHBand="0" w:evenHBand="0" w:firstRowFirstColumn="0" w:firstRowLastColumn="0" w:lastRowFirstColumn="0" w:lastRowLastColumn="0"/>
@@ -3816,11 +3847,11 @@
                   <w:szCs w:val="28"/>
                 </w:rPr>
                 <w:id w:val="1201051683"/>
-                <w14:checkbox>
-                  <w14:checked w14:val="0"/>
-                  <w14:checkedState w14:val="00FE" w14:font="Wingdings"/>
-                  <w14:uncheckedState w14:val="00A8" w14:font="Wingdings"/>
-                </w14:checkbox>
+                <ns2:checkbox>
+                  <ns2:checked ns2:val="0"/>
+                  <ns2:checkedState ns2:val="00FE" ns2:font="Wingdings"/>
+                  <ns2:uncheckedState ns2:val="00A8" ns2:font="Wingdings"/>
+                </ns2:checkbox>
               </w:sdtPr>
               <w:sdtContent>
                 <w:r>
@@ -3924,7 +3955,7 @@
           </w:p>
         </w:tc>
       </w:tr>
-      <w:tr>
+      <w:tr ns2:paraId="02E14712" ns2:textId="77777777">
         <w:tc>
           <w:tcPr>
             <w:cnfStyle w:val="001000000000" w:firstRow="0" w:lastRow="0" w:firstColumn="1" w:lastColumn="0" w:oddVBand="0" w:evenVBand="0" w:oddHBand="0" w:evenHBand="0" w:firstRowFirstColumn="0" w:firstRowLastColumn="0" w:lastRowFirstColumn="0" w:lastRowLastColumn="0"/>
@@ -3934,11 +3965,11 @@
               <w:top w:val="single" w:sz="2" w:space="0" w:color="9CC2E5" w:themeColor="accent5" w:themeTint="99"/>
               <w:left w:val="single" w:sz="2" w:space="0" w:color="9CC2E5" w:themeColor="accent5" w:themeTint="99"/>
               <w:bottom w:val="single" w:sz="2" w:space="0" w:color="9CC2E5" w:themeColor="accent5" w:themeTint="99"/>
-              <w:right w:val="nil"/>
+              <w:right w:val="single" w:sz="2" w:space="0" w:color="9CC2E5" w:themeColor="accent5" w:themeTint="99"/>
             </w:tcBorders>
             <w:shd w:val="clear" w:color="auto" w:fill="0070C0"/>
           </w:tcPr>
-          <w:p>
+          <w:p ns2:paraId="0E5BCF2C" ns2:textId="0085447B">
             <w:pPr>
               <w:jc w:val="center"/>
               <w:rPr>
@@ -3968,7 +3999,7 @@
               <w:bottom w:val="nil"/>
             </w:tcBorders>
           </w:tcPr>
-          <w:p>
+          <w:p ns2:paraId="732775B1" ns2:textId="77777777">
             <w:pPr>
               <w:cnfStyle w:val="000000000000" w:firstRow="0" w:lastRow="0" w:firstColumn="0" w:lastColumn="0" w:oddVBand="0" w:evenVBand="0" w:oddHBand="0" w:evenHBand="0" w:firstRowFirstColumn="0" w:firstRowLastColumn="0" w:lastRowFirstColumn="0" w:lastRowLastColumn="0"/>
             </w:pPr>
@@ -3979,8 +4010,11 @@
             <w:tcW w:w="4819" w:type="dxa"/>
             <w:gridSpan w:val="3"/>
             <w:vMerge w:val="restart"/>
+            <w:tcBorders>
+              <w:left w:val="single" w:sz="2" w:space="0" w:color="9CC2E5" w:themeColor="accent5" w:themeTint="99"/>
+            </w:tcBorders>
           </w:tcPr>
-          <w:p>
+          <w:p ns2:paraId="36436533" ns2:textId="77777777">
             <w:pPr>
               <w:spacing w:line="276" w:lineRule="auto"/>
               <w:ind w:left="-111" w:firstLine="111"/>
@@ -3995,7 +4029,7 @@
               </w:rPr>
             </w:pPr>
           </w:p>
-          <w:p>
+          <w:p ns2:paraId="056DB939" ns2:textId="77777777">
             <w:pPr>
               <w:spacing w:line="276" w:lineRule="auto"/>
               <w:ind w:left="-111" w:firstLine="111"/>
@@ -4021,7 +4055,7 @@
               <w:t>Dodatkowe wymagane cechy/wyposażenie:</w:t>
             </w:r>
           </w:p>
-          <w:p>
+          <w:p ns2:paraId="508E6C65" ns2:textId="1F5A7D5D">
             <w:pPr>
               <w:cnfStyle w:val="000000000000" w:firstRow="0" w:lastRow="0" w:firstColumn="0" w:lastColumn="0" w:oddVBand="0" w:evenVBand="0" w:oddHBand="0" w:evenHBand="0" w:firstRowFirstColumn="0" w:firstRowLastColumn="0" w:lastRowFirstColumn="0" w:lastRowLastColumn="0"/>
               <w:rPr>
@@ -4033,7 +4067,7 @@
           </w:p>
         </w:tc>
       </w:tr>
-      <w:tr>
+      <w:tr ns2:paraId="31F312BB" ns2:textId="77777777">
         <w:trPr>
           <w:trHeight w:val="731"/>
         </w:trPr>
@@ -4046,11 +4080,11 @@
             <w:tcBorders>
               <w:top w:val="single" w:sz="2" w:space="0" w:color="9CC2E5" w:themeColor="accent5" w:themeTint="99"/>
               <w:left w:val="single" w:sz="2" w:space="0" w:color="9CC2E5" w:themeColor="accent5" w:themeTint="99"/>
-              <w:right w:val="nil"/>
+              <w:right w:val="single" w:sz="2" w:space="0" w:color="9CC2E5" w:themeColor="accent5" w:themeTint="99"/>
             </w:tcBorders>
             <w:shd w:val="clear" w:color="auto" w:fill="FFFFFF" w:themeFill="background1"/>
           </w:tcPr>
-          <w:p>
+          <w:p ns2:paraId="27006F08" ns2:textId="77777777">
             <w:pPr>
               <w:spacing w:line="276" w:lineRule="auto"/>
               <w:ind w:right="-107"/>
@@ -4065,7 +4099,7 @@
             <w:bookmarkStart w:id="20" w:name="_Hlk181961122"/>
             <w:bookmarkStart w:id="21" w:name="OLE_LINK40"/>
           </w:p>
-          <w:p>
+          <w:p ns2:paraId="6AC999D4" ns2:textId="77777777">
             <w:pPr>
               <w:spacing w:line="276" w:lineRule="auto"/>
               <w:ind w:right="-107"/>
@@ -4148,7 +4182,7 @@
               <w:t xml:space="preserve"> </w:t>
             </w:r>
           </w:p>
-          <w:p>
+          <w:p ns2:paraId="50AA7498" ns2:textId="7F074022">
             <w:pPr>
               <w:spacing w:line="276" w:lineRule="auto"/>
               <w:ind w:right="-107"/>
@@ -4242,7 +4276,7 @@
               <w:br/>
             </w:r>
           </w:p>
-          <w:p>
+          <w:p ns2:paraId="3647DB9D" ns2:textId="5434461F">
             <w:pPr>
               <w:spacing w:line="276" w:lineRule="auto"/>
               <w:ind w:right="-107"/>
@@ -4415,7 +4449,7 @@
               <w:br/>
             </w:r>
           </w:p>
-          <w:p>
+          <w:p ns2:paraId="192F2FE7" ns2:textId="789A0921">
             <w:pPr>
               <w:pStyle w:val="NormalnyWeb"/>
               <w:spacing w:before="0" w:beforeAutospacing="0" w:after="0" w:afterAutospacing="0" w:line="276" w:lineRule="auto"/>
@@ -4558,7 +4592,7 @@
               <w:t xml:space="preserve"> brutto + 5% od ceny brutto pojazdu</w:t>
             </w:r>
           </w:p>
-          <w:p>
+          <w:p ns2:paraId="6AA5D9BD" ns2:textId="2DFAF404">
             <w:pPr>
               <w:pStyle w:val="NormalnyWeb"/>
               <w:spacing w:before="0" w:beforeAutospacing="0" w:after="0" w:afterAutospacing="0" w:line="276" w:lineRule="auto"/>
@@ -4581,7 +4615,7 @@
             </w:tcBorders>
             <w:shd w:val="clear" w:color="auto" w:fill="auto"/>
           </w:tcPr>
-          <w:p>
+          <w:p ns2:paraId="779F19EC" ns2:textId="77777777">
             <w:pPr>
               <w:cnfStyle w:val="000000000000" w:firstRow="0" w:lastRow="0" w:firstColumn="0" w:lastColumn="0" w:oddVBand="0" w:evenVBand="0" w:oddHBand="0" w:evenHBand="0" w:firstRowFirstColumn="0" w:firstRowLastColumn="0" w:lastRowFirstColumn="0" w:lastRowLastColumn="0"/>
             </w:pPr>
@@ -4593,8 +4627,11 @@
             <w:gridSpan w:val="3"/>
             <w:vMerge/>
             <w:shd w:val="clear" w:color="auto" w:fill="auto"/>
+            <w:tcBorders>
+              <w:left w:val="single" w:sz="2" w:space="0" w:color="9CC2E5" w:themeColor="accent5" w:themeTint="99"/>
+            </w:tcBorders>
           </w:tcPr>
-          <w:p>
+          <w:p ns2:paraId="2DB27303" ns2:textId="77777777">
             <w:pPr>
               <w:ind w:left="-111" w:firstLine="111"/>
               <w:jc w:val="right"/>
@@ -4608,7 +4645,7 @@
           </w:p>
         </w:tc>
       </w:tr>
-      <w:tr>
+      <w:tr ns2:paraId="116801D7" ns2:textId="77777777">
         <w:trPr>
           <w:trHeight w:val="771"/>
         </w:trPr>
@@ -4620,11 +4657,11 @@
             <w:vMerge/>
             <w:tcBorders>
               <w:left w:val="single" w:sz="2" w:space="0" w:color="9CC2E5" w:themeColor="accent5" w:themeTint="99"/>
-              <w:right w:val="nil"/>
+              <w:right w:val="single" w:sz="2" w:space="0" w:color="9CC2E5" w:themeColor="accent5" w:themeTint="99"/>
             </w:tcBorders>
             <w:shd w:val="clear" w:color="auto" w:fill="FFFFFF" w:themeFill="background1"/>
           </w:tcPr>
-          <w:p>
+          <w:p ns2:paraId="55226533" ns2:textId="77777777">
             <w:pPr>
               <w:ind w:right="-183"/>
               <w:rPr>
@@ -4645,7 +4682,7 @@
             </w:tcBorders>
             <w:shd w:val="clear" w:color="auto" w:fill="auto"/>
           </w:tcPr>
-          <w:p>
+          <w:p ns2:paraId="23914A7E" ns2:textId="77777777">
             <w:pPr>
               <w:cnfStyle w:val="000000000000" w:firstRow="0" w:lastRow="0" w:firstColumn="0" w:lastColumn="0" w:oddVBand="0" w:evenVBand="0" w:oddHBand="0" w:evenHBand="0" w:firstRowFirstColumn="0" w:firstRowLastColumn="0" w:lastRowFirstColumn="0" w:lastRowLastColumn="0"/>
             </w:pPr>
@@ -4656,8 +4693,11 @@
             <w:tcW w:w="4819" w:type="dxa"/>
             <w:gridSpan w:val="3"/>
             <w:shd w:val="clear" w:color="auto" w:fill="auto"/>
+            <w:tcBorders>
+              <w:left w:val="single" w:sz="2" w:space="0" w:color="9CC2E5" w:themeColor="accent5" w:themeTint="99"/>
+            </w:tcBorders>
           </w:tcPr>
-          <w:p>
+          <w:p ns2:paraId="7E8FFD49" ns2:textId="77777777">
             <w:pPr>
               <w:ind w:left="-111" w:firstLine="111"/>
               <w:cnfStyle w:val="000000000000" w:firstRow="0" w:lastRow="0" w:firstColumn="0" w:lastColumn="0" w:oddVBand="0" w:evenVBand="0" w:oddHBand="0" w:evenHBand="0" w:firstRowFirstColumn="0" w:firstRowLastColumn="0" w:lastRowFirstColumn="0" w:lastRowLastColumn="0"/>
@@ -4671,7 +4711,7 @@
               </w:rPr>
             </w:pPr>
           </w:p>
-          <w:p>
+          <w:p ns2:paraId="481B3B49" ns2:textId="77777777">
             <w:pPr>
               <w:ind w:left="-111" w:firstLine="111"/>
               <w:cnfStyle w:val="000000000000" w:firstRow="0" w:lastRow="0" w:firstColumn="0" w:lastColumn="0" w:oddVBand="0" w:evenVBand="0" w:oddHBand="0" w:evenHBand="0" w:firstRowFirstColumn="0" w:firstRowLastColumn="0" w:lastRowFirstColumn="0" w:lastRowLastColumn="0"/>
@@ -4696,7 +4736,7 @@
               <w:t>Dodatkowe oczekiwane cechy/wyposażenie:</w:t>
             </w:r>
           </w:p>
-          <w:p>
+          <w:p ns2:paraId="0F7EE01A" ns2:textId="7F84A929">
             <w:pPr>
               <w:ind w:left="-111" w:firstLine="111"/>
               <w:cnfStyle w:val="000000000000" w:firstRow="0" w:lastRow="0" w:firstColumn="0" w:lastColumn="0" w:oddVBand="0" w:evenVBand="0" w:oddHBand="0" w:evenHBand="0" w:firstRowFirstColumn="0" w:firstRowLastColumn="0" w:lastRowFirstColumn="0" w:lastRowLastColumn="0"/>
@@ -4712,7 +4752,7 @@
           </w:p>
         </w:tc>
       </w:tr>
-      <w:tr>
+      <w:tr ns2:paraId="5A0C7329" ns2:textId="77777777">
         <w:tc>
           <w:tcPr>
             <w:cnfStyle w:val="001000000000" w:firstRow="0" w:lastRow="0" w:firstColumn="1" w:lastColumn="0" w:oddVBand="0" w:evenVBand="0" w:oddHBand="0" w:evenHBand="0" w:firstRowFirstColumn="0" w:firstRowLastColumn="0" w:lastRowFirstColumn="0" w:lastRowLastColumn="0"/>
@@ -4723,7 +4763,7 @@
             </w:tcBorders>
             <w:shd w:val="clear" w:color="auto" w:fill="auto"/>
           </w:tcPr>
-          <w:p>
+          <w:p ns2:paraId="5E1B5804" ns2:textId="77777777">
             <w:pPr>
               <w:rPr>
                 <w:rFonts w:ascii="Calibri" w:hAnsi="Calibri"/>
@@ -4853,7 +4893,7 @@
           </w:p>
         </w:tc>
       </w:tr>
-      <w:tr>
+      <w:tr ns2:paraId="727B69BF" ns2:textId="77777777">
         <w:tblPrEx>
           <w:tblLook w:val="04A0" w:firstRow="1" w:lastRow="0" w:firstColumn="1" w:lastColumn="0" w:noHBand="0" w:noVBand="1"/>
         </w:tblPrEx>
@@ -4869,7 +4909,7 @@
             <w:gridSpan w:val="2"/>
             <w:shd w:val="clear" w:color="auto" w:fill="0070C0"/>
           </w:tcPr>
-          <w:p>
+          <w:p ns2:paraId="2AAAC057" ns2:textId="77777777">
             <w:pPr>
               <w:jc w:val="center"/>
               <w:rPr>
@@ -4905,7 +4945,7 @@
             </w:tcBorders>
             <w:shd w:val="clear" w:color="auto" w:fill="auto"/>
           </w:tcPr>
-          <w:p>
+          <w:p ns2:paraId="73A19847" ns2:textId="77777777">
             <w:pPr>
               <w:cnfStyle w:val="000000100000" w:firstRow="0" w:lastRow="0" w:firstColumn="0" w:lastColumn="0" w:oddVBand="0" w:evenVBand="0" w:oddHBand="1" w:evenHBand="0" w:firstRowFirstColumn="0" w:firstRowLastColumn="0" w:lastRowFirstColumn="0" w:lastRowLastColumn="0"/>
               <w:rPr>
@@ -4922,7 +4962,7 @@
             <w:gridSpan w:val="2"/>
             <w:shd w:val="clear" w:color="auto" w:fill="0070C0"/>
           </w:tcPr>
-          <w:p>
+          <w:p ns2:paraId="195BD15C" ns2:textId="77777777">
             <w:pPr>
               <w:ind w:left="-111" w:firstLine="111"/>
               <w:jc w:val="center"/>
@@ -4955,7 +4995,7 @@
           </w:p>
         </w:tc>
       </w:tr>
-      <w:tr>
+      <w:tr ns2:paraId="72F05A28" ns2:textId="77777777">
         <w:tblPrEx>
           <w:tblLook w:val="04A0" w:firstRow="1" w:lastRow="0" w:firstColumn="1" w:lastColumn="0" w:noHBand="0" w:noVBand="1"/>
         </w:tblPrEx>
@@ -4969,8 +5009,13 @@
             <w:tcW w:w="4820" w:type="dxa"/>
             <w:gridSpan w:val="2"/>
             <w:shd w:val="clear" w:color="auto" w:fill="auto"/>
+            <w:tcBorders>
+              <w:left w:val="single" w:sz="2" w:space="0" w:color="9CC2E5" w:themeColor="accent5" w:themeTint="99"/>
+              <w:right w:val="single" w:sz="2" w:space="0" w:color="9CC2E5" w:themeColor="accent5" w:themeTint="99"/>
+              <w:bottom w:val="single" w:sz="2" w:space="0" w:color="9CC2E5" w:themeColor="accent5" w:themeTint="99"/>
+            </w:tcBorders>
           </w:tcPr>
-          <w:p>
+          <w:p ns2:paraId="0394AE7D" ns2:textId="77777777">
             <w:pPr>
               <w:rPr>
                 <w:rFonts w:ascii="Calibri" w:hAnsi="Calibri"/>
@@ -4978,7 +5023,7 @@
               </w:rPr>
             </w:pPr>
           </w:p>
-          <w:p>
+          <w:p ns2:paraId="79F6ACAD" ns2:textId="77777777">
             <w:pPr>
               <w:rPr>
                 <w:rFonts w:ascii="Calibri" w:hAnsi="Calibri"/>
@@ -4986,7 +5031,7 @@
               </w:rPr>
             </w:pPr>
           </w:p>
-          <w:p>
+          <w:p ns2:paraId="074B5CB1" ns2:textId="77777777">
             <w:pPr>
               <w:jc w:val="right"/>
               <w:rPr>
@@ -5007,7 +5052,7 @@
             </w:tcBorders>
             <w:shd w:val="clear" w:color="auto" w:fill="auto"/>
           </w:tcPr>
-          <w:p>
+          <w:p ns2:paraId="712F9EBB" ns2:textId="77777777">
             <w:pPr>
               <w:cnfStyle w:val="000000000000" w:firstRow="0" w:lastRow="0" w:firstColumn="0" w:lastColumn="0" w:oddVBand="0" w:evenVBand="0" w:oddHBand="0" w:evenHBand="0" w:firstRowFirstColumn="0" w:firstRowLastColumn="0" w:lastRowFirstColumn="0" w:lastRowLastColumn="0"/>
               <w:rPr>
@@ -5022,8 +5067,13 @@
             <w:tcW w:w="4809" w:type="dxa"/>
             <w:gridSpan w:val="2"/>
             <w:shd w:val="clear" w:color="auto" w:fill="auto"/>
+            <w:tcBorders>
+              <w:left w:val="single" w:sz="2" w:space="0" w:color="9CC2E5" w:themeColor="accent5" w:themeTint="99"/>
+              <w:right w:val="single" w:sz="2" w:space="0" w:color="9CC2E5" w:themeColor="accent5" w:themeTint="99"/>
+              <w:bottom w:val="single" w:sz="2" w:space="0" w:color="9CC2E5" w:themeColor="accent5" w:themeTint="99"/>
+            </w:tcBorders>
           </w:tcPr>
-          <w:p>
+          <w:p ns2:paraId="4AE9611F" ns2:textId="77777777">
             <w:pPr>
               <w:cnfStyle w:val="000000000000" w:firstRow="0" w:lastRow="0" w:firstColumn="0" w:lastColumn="0" w:oddVBand="0" w:evenVBand="0" w:oddHBand="0" w:evenHBand="0" w:firstRowFirstColumn="0" w:firstRowLastColumn="0" w:lastRowFirstColumn="0" w:lastRowLastColumn="0"/>
               <w:rPr>
@@ -5032,7 +5082,7 @@
               </w:rPr>
             </w:pPr>
           </w:p>
-          <w:p>
+          <w:p ns2:paraId="763FBF65" ns2:textId="77777777">
             <w:pPr>
               <w:ind w:left="-111" w:firstLine="111"/>
               <w:cnfStyle w:val="000000000000" w:firstRow="0" w:lastRow="0" w:firstColumn="0" w:lastColumn="0" w:oddVBand="0" w:evenVBand="0" w:oddHBand="0" w:evenHBand="0" w:firstRowFirstColumn="0" w:firstRowLastColumn="0" w:lastRowFirstColumn="0" w:lastRowLastColumn="0"/>
@@ -5042,7 +5092,7 @@
               </w:rPr>
             </w:pPr>
           </w:p>
-          <w:p>
+          <w:p ns2:paraId="069E7D6E" ns2:textId="77777777">
             <w:pPr>
               <w:cnfStyle w:val="000000000000" w:firstRow="0" w:lastRow="0" w:firstColumn="0" w:lastColumn="0" w:oddVBand="0" w:evenVBand="0" w:oddHBand="0" w:evenHBand="0" w:firstRowFirstColumn="0" w:firstRowLastColumn="0" w:lastRowFirstColumn="0" w:lastRowLastColumn="0"/>
               <w:rPr>
@@ -5051,7 +5101,7 @@
               </w:rPr>
             </w:pPr>
           </w:p>
-          <w:p>
+          <w:p ns2:paraId="093EA27B" ns2:textId="77777777">
             <w:pPr>
               <w:ind w:left="-111" w:firstLine="111"/>
               <w:cnfStyle w:val="000000000000" w:firstRow="0" w:lastRow="0" w:firstColumn="0" w:lastColumn="0" w:oddVBand="0" w:evenVBand="0" w:oddHBand="0" w:evenHBand="0" w:firstRowFirstColumn="0" w:firstRowLastColumn="0" w:lastRowFirstColumn="0" w:lastRowLastColumn="0"/>
@@ -5061,7 +5111,7 @@
               </w:rPr>
             </w:pPr>
           </w:p>
-          <w:p>
+          <w:p ns2:paraId="42EC0108" ns2:textId="77777777">
             <w:pPr>
               <w:ind w:left="-111" w:firstLine="111"/>
               <w:cnfStyle w:val="000000000000" w:firstRow="0" w:lastRow="0" w:firstColumn="0" w:lastColumn="0" w:oddVBand="0" w:evenVBand="0" w:oddHBand="0" w:evenHBand="0" w:firstRowFirstColumn="0" w:firstRowLastColumn="0" w:lastRowFirstColumn="0" w:lastRowLastColumn="0"/>
@@ -5076,10 +5126,10 @@
         </w:tc>
       </w:tr>
     </w:tbl>
-    <w:p>
+    <w:p ns2:paraId="09BFB0F6" ns2:textId="77777777">
       <w:pPr>
         <w:sectPr>
-          <w:footerReference w:type="default" r:id="rId11"/>
+          <w:footerReference w:type="default" ns7:id="rId11"/>
           <w:pgSz w:w="11900" w:h="16840"/>
           <w:pgMar w:top="1165" w:right="1417" w:bottom="889" w:left="1417" w:header="708" w:footer="708" w:gutter="0"/>
           <w:cols w:space="708"/>
@@ -5087,7 +5137,7 @@
         </w:sectPr>
       </w:pPr>
     </w:p>
-    <w:p>
+    <w:p ns2:paraId="19F48D95" ns2:textId="77777777">
       <w:pPr>
         <w:rPr>
           <w:rFonts w:ascii="Calibri" w:hAnsi="Calibri"/>
@@ -5113,55 +5163,55 @@
           <w:noProof/>
         </w:rPr>
         <w:drawing>
-          <wp:inline distT="0" distB="0" distL="0" distR="0" wp14:anchorId="29E923B8" wp14:editId="700C057C">
-            <wp:extent cx="2539365" cy="611505"/>
-            <wp:effectExtent l="0" t="0" r="635" b="0"/>
-            <wp:docPr id="1012593150" name="Obraz 1"/>
-            <wp:cNvGraphicFramePr>
-              <a:graphicFrameLocks xmlns:a="http://schemas.openxmlformats.org/drawingml/2006/main" noChangeAspect="1"/>
-            </wp:cNvGraphicFramePr>
-            <a:graphic xmlns:a="http://schemas.openxmlformats.org/drawingml/2006/main">
-              <a:graphicData uri="http://schemas.openxmlformats.org/drawingml/2006/picture">
-                <pic:pic xmlns:pic="http://schemas.openxmlformats.org/drawingml/2006/picture">
-                  <pic:nvPicPr>
-                    <pic:cNvPr id="1012593150" name="Picture 1"/>
-                    <pic:cNvPicPr>
-                      <a:picLocks noChangeAspect="1" noChangeArrowheads="1"/>
-                    </pic:cNvPicPr>
-                  </pic:nvPicPr>
-                  <pic:blipFill>
-                    <a:blip r:embed="rId8" r:link="rId9">
-                      <a:extLst>
-                        <a:ext uri="{28A0092B-C50C-407E-A947-70E740481C1C}">
-                          <a14:useLocalDpi xmlns:a14="http://schemas.microsoft.com/office/drawing/2010/main" val="0"/>
-                        </a:ext>
-                      </a:extLst>
-                    </a:blip>
-                    <a:stretch>
-                      <a:fillRect/>
-                    </a:stretch>
-                  </pic:blipFill>
-                  <pic:spPr bwMode="auto">
-                    <a:xfrm>
-                      <a:off x="0" y="0"/>
-                      <a:ext cx="2539365" cy="611505"/>
-                    </a:xfrm>
-                    <a:prstGeom prst="rect">
-                      <a:avLst/>
-                    </a:prstGeom>
-                    <a:noFill/>
-                    <a:ln>
-                      <a:noFill/>
-                    </a:ln>
-                  </pic:spPr>
-                </pic:pic>
-              </a:graphicData>
-            </a:graphic>
-          </wp:inline>
+          <ns3:inline distT="0" distB="0" distL="0" distR="0" ns4:anchorId="29E923B8" ns4:editId="700C057C">
+            <ns3:extent cx="2539365" cy="611505"/>
+            <ns3:effectExtent l="0" t="0" r="635" b="0"/>
+            <ns3:docPr id="1012593150" name="Obraz 1"/>
+            <ns3:cNvGraphicFramePr>
+              <ns5:graphicFrameLocks noChangeAspect="1"/>
+            </ns3:cNvGraphicFramePr>
+            <ns5:graphic>
+              <ns5:graphicData uri="http://schemas.openxmlformats.org/drawingml/2006/picture">
+                <ns6:pic>
+                  <ns6:nvPicPr>
+                    <ns6:cNvPr id="1012593150" name="Picture 1"/>
+                    <ns6:cNvPicPr>
+                      <ns5:picLocks noChangeAspect="1" noChangeArrowheads="1"/>
+                    </ns6:cNvPicPr>
+                  </ns6:nvPicPr>
+                  <ns6:blipFill>
+                    <ns5:blip ns7:embed="rId8" ns7:link="rId9">
+                      <ns5:extLst>
+                        <ns5:ext uri="{28A0092B-C50C-407E-A947-70E740481C1C}">
+                          <ns8:useLocalDpi val="0"/>
+                        </ns5:ext>
+                      </ns5:extLst>
+                    </ns5:blip>
+                    <ns5:stretch>
+                      <ns5:fillRect/>
+                    </ns5:stretch>
+                  </ns6:blipFill>
+                  <ns6:spPr bwMode="auto">
+                    <ns5:xfrm>
+                      <ns5:off x="0" y="0"/>
+                      <ns5:ext cx="2539365" cy="611505"/>
+                    </ns5:xfrm>
+                    <ns5:prstGeom prst="rect">
+                      <ns5:avLst/>
+                    </ns5:prstGeom>
+                    <ns5:noFill/>
+                    <ns5:ln>
+                      <ns5:noFill/>
+                    </ns5:ln>
+                  </ns6:spPr>
+                </ns6:pic>
+              </ns5:graphicData>
+            </ns5:graphic>
+          </ns3:inline>
         </w:drawing>
       </w:r>
     </w:p>
-    <w:p>
+    <w:p ns2:paraId="55E85A27" ns2:textId="77777777">
       <w:pPr>
         <w:spacing w:before="100" w:beforeAutospacing="1" w:after="100" w:afterAutospacing="1"/>
         <w:rPr>
@@ -5170,7 +5220,7 @@
           <w:bCs/>
         </w:rPr>
         <w:sectPr>
-          <w:footerReference w:type="default" r:id="rId12"/>
+          <w:footerReference w:type="default" ns7:id="rId12"/>
           <w:pgSz w:w="11900" w:h="16840"/>
           <w:pgMar w:top="1165" w:right="1417" w:bottom="889" w:left="1417" w:header="708" w:footer="708" w:gutter="0"/>
           <w:pgNumType w:start="2"/>
@@ -5179,7 +5229,7 @@
         </w:sectPr>
       </w:pPr>
     </w:p>
-    <w:p>
+    <w:p ns2:paraId="4DD77FE1" ns2:textId="77777777">
       <w:pPr>
         <w:spacing w:before="100" w:beforeAutospacing="1" w:after="100" w:afterAutospacing="1"/>
         <w:rPr>
@@ -5190,7 +5240,7 @@
         </w:rPr>
       </w:pPr>
     </w:p>
-    <w:p>
+    <w:p ns2:paraId="5F51C24A" ns2:textId="77777777">
       <w:pPr>
         <w:spacing w:before="100" w:beforeAutospacing="1" w:after="100" w:afterAutospacing="1"/>
         <w:rPr>
@@ -5247,7 +5297,7 @@
         <w:tab/>
       </w:r>
     </w:p>
-    <w:p>
+    <w:p ns2:paraId="762AA582" ns2:textId="0771C90F">
       <w:pPr>
         <w:ind w:left="284"/>
         <w:jc w:val="both"/>
@@ -5291,7 +5341,7 @@
         <w:t> </w:t>
       </w:r>
     </w:p>
-    <w:p>
+    <w:p ns2:paraId="1D8F8D3F" ns2:textId="77777777">
       <w:pPr>
         <w:jc w:val="both"/>
         <w:rPr>
@@ -5300,7 +5350,7 @@
         </w:rPr>
       </w:pPr>
     </w:p>
-    <w:p>
+    <w:p ns2:paraId="720E4B11" ns2:textId="73018D1D">
       <w:pPr>
         <w:jc w:val="both"/>
         <w:rPr>
@@ -5331,7 +5381,7 @@
         <w:t xml:space="preserve"> informuję, że:</w:t>
       </w:r>
     </w:p>
-    <w:p>
+    <w:p ns2:paraId="2962B799" ns2:textId="77777777">
       <w:pPr>
         <w:numPr>
           <w:ilvl w:val="0"/>
@@ -5427,7 +5477,7 @@
         <w:t xml:space="preserve">. </w:t>
       </w:r>
     </w:p>
-    <w:p>
+    <w:p ns2:paraId="4B2A3C20" ns2:textId="77777777">
       <w:pPr>
         <w:numPr>
           <w:ilvl w:val="0"/>
@@ -5463,7 +5513,7 @@
         <w:t>.</w:t>
       </w:r>
     </w:p>
-    <w:p>
+    <w:p ns2:paraId="2E5185C5" ns2:textId="77777777">
       <w:pPr>
         <w:numPr>
           <w:ilvl w:val="0"/>
@@ -5499,7 +5549,7 @@
         <w:t>żądanie jako osoby, której dane dotyczą, przed zawarciem umowy. Brak podania danych uniemożliwi podjęcie przez administratora żądanych działań (w tym przekazanie informacji), jak też uniemożliwi zawarcie i realizację umowy.</w:t>
       </w:r>
     </w:p>
-    <w:p>
+    <w:p ns2:paraId="0885B0DC" ns2:textId="77777777">
       <w:pPr>
         <w:numPr>
           <w:ilvl w:val="0"/>
@@ -5563,7 +5613,7 @@
         <w:t xml:space="preserve"> w celu umożliwienia dochodzenia roszczeń mogących wynikać z zawartej umowy) - na podstawie art. 6 ust. 1 lit. f RODO.</w:t>
       </w:r>
     </w:p>
-    <w:p>
+    <w:p ns2:paraId="0BDE96AE" ns2:textId="77777777">
       <w:pPr>
         <w:numPr>
           <w:ilvl w:val="0"/>
@@ -5585,7 +5635,7 @@
         <w:t>Twoje dane osobowe przechowywane będą: w celu zawarcia umowy - przez okres niezbędny do podjęcia i przeprowadzenia działań na Twoje żądanie jako osoby, której dane dotyczą przed zawarciem umowy, a w przypadku zawarcia z Tobą umowy, przez okres niezbędny dla realizacji umowy; nadto w celu zabezpieczenia i realizacji prawnie uzasadnionych interesów administratora – przez okres przedawnienia roszczeń mogących wynikać z umowy; administrator może przechowywać Twoje dane osobowe przez dłuższy okres niż wskazany wyłącznie, gdy będzie istniała inna podstawa przetwarzania Twoich danych osobowych określona w art. 6 ust. 1 RODO.</w:t>
       </w:r>
     </w:p>
-    <w:p>
+    <w:p ns2:paraId="754751DF" ns2:textId="77777777">
       <w:pPr>
         <w:numPr>
           <w:ilvl w:val="0"/>
@@ -5635,7 +5685,7 @@
         <w:t xml:space="preserve"> zawieranej i wykonywanej umowy, nie planuje przekazywać danych innym administratorom. W razie powstania rzeczowej potrzeby odbiorcami danych będą mogły być podmioty, którym administrator powierzy dane do przetwarzania w imieniu administratora zgodnie z art. 28 RODO.</w:t>
       </w:r>
     </w:p>
-    <w:p>
+    <w:p ns2:paraId="4C1CCED9" ns2:textId="77777777">
       <w:pPr>
         <w:numPr>
           <w:ilvl w:val="0"/>
@@ -5657,7 +5707,7 @@
         <w:t>Dane nie będą przekazywane do państwa trzeciego (poza terytorium Unii Europejskiej i Europejskiego Obszaru Gospodarczego), nie będą też podlegać zautomatyzowanemu podejmowaniu decyzji lub profilowaniu.</w:t>
       </w:r>
     </w:p>
-    <w:p>
+    <w:p ns2:paraId="083837D2" ns2:textId="77777777">
       <w:pPr>
         <w:numPr>
           <w:ilvl w:val="0"/>
@@ -5707,7 +5757,7 @@
         <w:t>.</w:t>
       </w:r>
     </w:p>
-    <w:p>
+    <w:p ns2:paraId="6FC236B9" ns2:textId="12CF8F7A">
       <w:pPr>
         <w:numPr>
           <w:ilvl w:val="0"/>
@@ -5757,7 +5807,7 @@
         <w:t>danych osobowych opartego na art. 6 ust. 1 lit. e lub f RODO - w ramach art. 21 RODO.</w:t>
       </w:r>
     </w:p>
-    <w:p>
+    <w:p ns2:paraId="7AB89AAF" ns2:textId="77777777">
       <w:pPr>
         <w:ind w:left="284"/>
         <w:rPr>
@@ -5779,7 +5829,7 @@
         <w:t>2. Regulamin - Szczegółowe Warunki Umowy</w:t>
       </w:r>
     </w:p>
-    <w:p>
+    <w:p ns2:paraId="25E4805E" ns2:textId="77777777">
       <w:pPr>
         <w:rPr>
           <w:rFonts w:eastAsiaTheme="minorHAnsi"/>
@@ -5790,7 +5840,7 @@
         </w:rPr>
       </w:pPr>
     </w:p>
-    <w:p>
+    <w:p ns2:paraId="5977FDAB" ns2:textId="77777777">
       <w:pPr>
         <w:pStyle w:val="Akapitzlist"/>
         <w:numPr>
@@ -5932,7 +5982,7 @@
         <w:t>wskazanym w treści umowy.</w:t>
       </w:r>
     </w:p>
-    <w:p>
+    <w:p ns2:paraId="5137CBBA" ns2:textId="77777777">
       <w:pPr>
         <w:pStyle w:val="Akapitzlist"/>
         <w:numPr>
@@ -5972,7 +6022,7 @@
         <w:t>egulaminu a daną umową rozstrzygająca jest treść umowy.</w:t>
       </w:r>
     </w:p>
-    <w:p>
+    <w:p ns2:paraId="2A29A90B" ns2:textId="77777777">
       <w:pPr>
         <w:pStyle w:val="Akapitzlist"/>
         <w:numPr>
@@ -6052,7 +6102,7 @@
         <w:t>w tym również z wykorzystaniem finansowania zewnętrznego (leasing, kredyt lub płatność odroczona), bądź na zakupie pojazdu wskazanego bezpośrednio przez Zleceniodawcę (np. z aukcji lub oferty), dokonywanym w jego imieniu.</w:t>
       </w:r>
     </w:p>
-    <w:p>
+    <w:p ns2:paraId="38037029" ns2:textId="4480BDFE">
       <w:pPr>
         <w:pStyle w:val="Akapitzlist"/>
         <w:numPr>
@@ -6162,7 +6212,7 @@
         <w:t xml:space="preserve"> przeprowadzenie przeglądu technicznego (opłata po stronie Zleceniodawcy), przygotowanie dokumentów do rejestracji oraz przygotowanie pojazdu do wydania.</w:t>
       </w:r>
     </w:p>
-    <w:p>
+    <w:p ns2:paraId="46602863" ns2:textId="77777777">
       <w:pPr>
         <w:pStyle w:val="Akapitzlist"/>
         <w:numPr>
@@ -6194,7 +6244,7 @@
         <w:t>.</w:t>
       </w:r>
     </w:p>
-    <w:p>
+    <w:p ns2:paraId="2FD716FF" ns2:textId="77777777">
       <w:pPr>
         <w:pStyle w:val="Akapitzlist"/>
         <w:numPr>
@@ -6220,7 +6270,7 @@
       <w:bookmarkStart w:id="29" w:name="_Hlk181961545"/>
       <w:bookmarkStart w:id="30" w:name="OLE_LINK42"/>
     </w:p>
-    <w:p>
+    <w:p ns2:paraId="7CF377C1" ns2:textId="77777777">
       <w:pPr>
         <w:pStyle w:val="Akapitzlist"/>
         <w:numPr>
@@ -6286,7 +6336,7 @@
         <w:t>, na co Zleceniobiorca nie ma wpływu. Umowa będzie uważana za należycie wykonaną przez Zleceniobiorcę nawet w przypadku zaistnienia takiego odstępstwa.</w:t>
       </w:r>
     </w:p>
-    <w:p>
+    <w:p ns2:paraId="40086DE2" ns2:textId="77777777">
       <w:pPr>
         <w:pStyle w:val="Akapitzlist"/>
         <w:numPr>
@@ -6390,7 +6440,7 @@
         <w:t>.</w:t>
       </w:r>
     </w:p>
-    <w:p>
+    <w:p ns2:paraId="2C7D19A4" ns2:textId="77777777">
       <w:pPr>
         <w:pStyle w:val="Akapitzlist"/>
         <w:numPr>
@@ -6414,7 +6464,7 @@
         <w:t>Zleceniodawca akceptuje, że w internetowych serwisach aukcyjnych do których dostęp mają jedynie osoby zawodowo handlujące pojazdami, odpowiedzialność sprzedającego może być istotnie ograniczona lub wyłączona, na co Zleceniobiorca nie ma wpływu. Internetowe aukcje mogą także nie dojść do skutku nawet w przypadku wylicytowania auta z przyczyn niezależnych od Zleceniobiorcy. W takim przypadku i stwierdzenia wad Samochodu Zleceniobiorca przeleje na Zleceniodawcę, na jego żądanie, wszelkie przysługujące mu uprawnienia co do wad Samochodu.</w:t>
       </w:r>
     </w:p>
-    <w:p>
+    <w:p ns2:paraId="41DEBE93" ns2:textId="7A731769">
       <w:pPr>
         <w:pStyle w:val="Akapitzlist"/>
         <w:numPr>
@@ -6582,7 +6632,7 @@
         <w:t>ustalany jest według kursu wymiany obowiązującego w banku Zleceniobiorcy w dniu dokonania zapłaty.</w:t>
       </w:r>
     </w:p>
-    <w:p>
+    <w:p ns2:paraId="25B77A9B" ns2:textId="77777777">
       <w:pPr>
         <w:pStyle w:val="Akapitzlist"/>
         <w:numPr>
@@ -6606,7 +6656,7 @@
         <w:t>Zleceniodawca zostanie powiadomiony o kwocie wpłaty potrzebnej do sfinalizowania zakupu. Zleceniodawca zobowiązany jest do zapłaty tej kwoty w ciągu 2 dni roboczych. W razie niedokonania zapłaty w podanym terminie Zleceniobiorca będzie mógł odstąpić od niniejszej umowy zamówienia w ciągu kolejnego miesiąca.</w:t>
       </w:r>
     </w:p>
-    <w:p>
+    <w:p ns2:paraId="1BFC6CD6" ns2:textId="7996B53D">
       <w:pPr>
         <w:pStyle w:val="Akapitzlist"/>
         <w:numPr>
@@ -6645,7 +6695,7 @@
         <w:t>pojazdu, usługi, tłumaczenia dokumentów, przegląd techniczny, rejestracja pojazdu czy inne czynności administracyjne, nie są objęte wynagrodzeniem Zleceniobiorcy wynikającym z niniejszej umowy. Wszelkie tego rodzaju koszty są każdorazowo uzgadniane odrębnie pomiędzy Stronami przed ich poniesieniem.</w:t>
       </w:r>
     </w:p>
-    <w:p>
+    <w:p ns2:paraId="3200A09C" ns2:textId="3621A9ED">
       <w:pPr>
         <w:pStyle w:val="Akapitzlist"/>
         <w:numPr>
@@ -6685,7 +6735,7 @@
         <w:t>, tłumaczenia dokumentów, czy inne czynności administracyjne lub serwisowe, wymagają każdorazowo uprzedniej, wyraźnej akceptacji Zleceniodawcy w formie pisemnej, w tym także w formie wiadomości e-mail, SMS lub za pośrednictwem innego środka komunikacji elektronicznej powiązanego z numerem telefonu Zleceniodawcy.</w:t>
       </w:r>
     </w:p>
-    <w:p>
+    <w:p ns2:paraId="462F0036" ns2:textId="77777777">
       <w:pPr>
         <w:pStyle w:val="Akapitzlist"/>
         <w:numPr>
@@ -6725,7 +6775,7 @@
         <w:t>Zleceniobiorcy przysługuje prawo do naliczenia uzasadnionych kosztów administracyjnych i księgowych poniesionych w związku z obsługą takiej płatności, w tym m.in. kosztów wystawienia lub korekty faktur, rozliczeń oraz dodatkowej ewidencji.</w:t>
       </w:r>
     </w:p>
-    <w:p>
+    <w:p ns2:paraId="104D42E7" ns2:textId="453E141F">
       <w:pPr>
         <w:pStyle w:val="Akapitzlist"/>
         <w:numPr>
@@ -6805,7 +6855,7 @@
         <w:t>.</w:t>
       </w:r>
     </w:p>
-    <w:p>
+    <w:p ns2:paraId="03ED9CB7" ns2:textId="77777777">
       <w:pPr>
         <w:pStyle w:val="Akapitzlist"/>
         <w:numPr>
@@ -6829,7 +6879,7 @@
         <w:t>Zleceniodawca jest zobowiązany do:</w:t>
       </w:r>
     </w:p>
-    <w:p>
+    <w:p ns2:paraId="4DA1D180" ns2:textId="77777777">
       <w:pPr>
         <w:pStyle w:val="Akapitzlist"/>
         <w:numPr>
@@ -6854,7 +6904,7 @@
         <w:t xml:space="preserve"> współdziałania ze Zleceniobiorcą przy wykonywaniu niniejszej umowy</w:t>
       </w:r>
     </w:p>
-    <w:p>
+    <w:p ns2:paraId="53EEFE1B" ns2:textId="77777777">
       <w:pPr>
         <w:pStyle w:val="Akapitzlist"/>
         <w:numPr>
@@ -6891,7 +6941,7 @@
       <w:bookmarkEnd w:id="31"/>
       <w:bookmarkEnd w:id="32"/>
     </w:p>
-    <w:p>
+    <w:p ns2:paraId="12972D26" ns2:textId="77777777">
       <w:pPr>
         <w:pStyle w:val="Akapitzlist"/>
         <w:numPr>
@@ -6916,7 +6966,7 @@
         <w:t>w razie zlecenia rejestracji - kosztów wykonania przeglądu technicznego i rejestracji, zapłaty akcyzy i opłat publicznoprawnych bezpośrednio do organów skarbowych, na wezwanie Zleceniobiorcy</w:t>
       </w:r>
     </w:p>
-    <w:p>
+    <w:p ns2:paraId="7A254C50" ns2:textId="01CAAC5F">
       <w:pPr>
         <w:pStyle w:val="Akapitzlist"/>
         <w:numPr>
@@ -6941,7 +6991,7 @@
         <w:t>zapłaty wynagrodzenia przewidzianego umową i kosztów transportu auta w wykonaniu umowy.</w:t>
       </w:r>
     </w:p>
-    <w:p>
+    <w:p ns2:paraId="423D897B" ns2:textId="77777777">
       <w:pPr>
         <w:pStyle w:val="Akapitzlist"/>
         <w:numPr>
@@ -6965,7 +7015,7 @@
         <w:t>W razie, gdy Zleceniobiorca wynegocjuje rabat od dealera samochodowego, skutkujący obniżeniem ostatecznego kosztu zakupu pojazdu, Zleceniodawca zapłaci Zleceniobiorcy dodatkowe wynagrodzenie w kwocie 30% uzyskanego rabatu.</w:t>
       </w:r>
     </w:p>
-    <w:p>
+    <w:p ns2:paraId="68B169DB" ns2:textId="77777777">
       <w:pPr>
         <w:pStyle w:val="Akapitzlist"/>
         <w:numPr>
@@ -7057,7 +7107,7 @@
         <w:t>+VAT za każdy dzień.</w:t>
       </w:r>
     </w:p>
-    <w:p>
+    <w:p ns2:paraId="66870DDC" ns2:textId="77777777">
       <w:pPr>
         <w:pStyle w:val="Akapitzlist"/>
         <w:numPr>
@@ -7078,10 +7128,10 @@
           <w:sz w:val="12"/>
           <w:szCs w:val="12"/>
         </w:rPr>
-        <w:t>Odpowiedzialność Zleceniobiorcy ograniczona jest do winy umyślnej oraz rażącego niedbalstwa, a także do szkody rzeczywistej i uzgodnionej kwoty zadatku. To postanowienie nie dotyczy konsumentów i przedsiębiorców zawierających umowę niemającą charakteru zawodowego.</w:t>
+        <w:t>Odpowiedzialność Zleceniobiorcy ograniczona jest do winy umyślnej oraz rażącego niedbalstwa, a także do szkody rzeczywistej i uzgodnionej kwoty zaliczki. To postanowienie nie dotyczy konsumentów i przedsiębiorców zawierających umowę niemającą charakteru zawodowego.</w:t>
       </w:r>
     </w:p>
-    <w:p>
+    <w:p ns2:paraId="5866AF39" ns2:textId="77777777">
       <w:pPr>
         <w:pStyle w:val="Akapitzlist"/>
         <w:numPr>
@@ -7337,7 +7387,7 @@
         <w:t>.</w:t>
       </w:r>
     </w:p>
-    <w:p>
+    <w:p ns2:paraId="08921987" ns2:textId="624E46C1">
       <w:pPr>
         <w:pStyle w:val="Akapitzlist"/>
         <w:numPr>
@@ -7425,7 +7475,7 @@
         <w:t xml:space="preserve">ulegnie pomniejszeniu o poniesione koszty związane z realizacją tych czynności. </w:t>
       </w:r>
     </w:p>
-    <w:p>
+    <w:p ns2:paraId="24239992" ns2:textId="77777777">
       <w:pPr>
         <w:pStyle w:val="Akapitzlist"/>
         <w:numPr>
@@ -7465,7 +7515,7 @@
         <w:t>.</w:t>
       </w:r>
     </w:p>
-    <w:p>
+    <w:p ns2:paraId="32368F5F" ns2:textId="77777777">
       <w:pPr>
         <w:pStyle w:val="Akapitzlist"/>
         <w:numPr>
@@ -7505,7 +7555,7 @@
         <w:t xml:space="preserve"> drogą elektroniczną na adres e-mail Zleceniobiorcy: info@autogood.pl, uznawana jest za ważną i wywołującą skutki prawne z chwilą jej doręczenia na wskazany adres.</w:t>
       </w:r>
     </w:p>
-    <w:p>
+    <w:p ns2:paraId="06082F2F" ns2:textId="75AE13B2">
       <w:pPr>
         <w:pStyle w:val="Akapitzlist"/>
         <w:numPr>

</xml_diff>

<commit_message>
Update order contract advance terminology
</commit_message>
<xml_diff>
--- a/contract-pdf-work/templates/Umowa_Zamowienia_Pojazdu_AG_template.docx
+++ b/contract-pdf-work/templates/Umowa_Zamowienia_Pojazdu_AG_template.docx
@@ -576,7 +576,7 @@
                 <w:szCs w:val="18"/>
                 <w:u w:val="single"/>
               </w:rPr>
-              <w:t>A</w:t>
+              <w:t>Adres zamieszkania</w:t>
             </w:r>
             <w:r>
               <w:rPr>
@@ -585,7 +585,7 @@
                 <w:szCs w:val="18"/>
                 <w:u w:val="single"/>
               </w:rPr>
-              <w:t>dres</w:t>
+              <w:t/>
             </w:r>
             <w:r>
               <w:rPr>
@@ -6844,7 +6844,7 @@
           <w:sz w:val="12"/>
           <w:szCs w:val="12"/>
         </w:rPr>
-        <w:t xml:space="preserve"> bezwarunkowo przed dokonaniem zakupu pojazdu. Pozostała część budżetu obejmująca różnicę pomiędzy łącznym budżetem wskazanym w umowie a sumą wpłaconych zadatków, płatna w terminie nieprzekraczającym 14 dni roboczych od dnia dostarczenia pojazdu do siedziby Zleceniobiorcy. Niewywiązanie się przez Zleceniodawcę z któregokolwiek z powyższych obowiązków płatniczych w określonych terminach stanowi istotne naruszenie umowy i uprawnia Zleceniobiorcę do zatrzymania całości kwoty wpłaconych zadatków</w:t>
+        <w:t xml:space="preserve"> bezwarunkowo przed dokonaniem zakupu pojazdu. Pozostała część budżetu obejmująca różnicę pomiędzy łącznym budżetem wskazanym w umowie a sumą wpłaconych zaliczek, płatna w terminie nieprzekraczającym 14 dni roboczych od dnia dostarczenia pojazdu do siedziby Zleceniobiorcy. Niewywiązanie się przez Zleceniodawcę z któregokolwiek z powyższych obowiązków płatniczych w określonych terminach stanowi istotne naruszenie umowy i uprawnia Zleceniobiorcę do zatrzymania całości kwoty wpłaconych zaliczek</w:t>
       </w:r>
       <w:r>
         <w:rPr>

</xml_diff>